<commit_message>
Activate vulnerability feeds automatically in grc_setup.py and sync evidences to match DEV02 cleaned-up state
</commit_message>
<xml_diff>
--- a/evidences/IT-Notfallplan-0.3.docx
+++ b/evidences/IT-Notfallplan-0.3.docx
@@ -479,8 +479,11 @@
             <w:rPr>
               <w:rFonts w:eastAsiaTheme="minorEastAsia"/>
               <w:noProof/>
-              <w:sz w:val="22"/>
+              <w:kern w:val="2"/>
+              <w:sz w:val="24"/>
+              <w:szCs w:val="24"/>
               <w:lang w:eastAsia="de-DE"/>
+              <w14:ligatures w14:val="standardContextual"/>
             </w:rPr>
           </w:pPr>
           <w:r>
@@ -492,7 +495,7 @@
           <w:r>
             <w:fldChar w:fldCharType="separate"/>
           </w:r>
-          <w:hyperlink w:anchor="_Toc72093736" w:history="1">
+          <w:hyperlink w:anchor="_Toc232344651" w:history="1">
             <w:r>
               <w:rPr>
                 <w:rStyle w:val="Hyperlink"/>
@@ -504,8 +507,11 @@
               <w:rPr>
                 <w:rFonts w:eastAsiaTheme="minorEastAsia"/>
                 <w:noProof/>
-                <w:sz w:val="22"/>
+                <w:kern w:val="2"/>
+                <w:sz w:val="24"/>
+                <w:szCs w:val="24"/>
                 <w:lang w:eastAsia="de-DE"/>
+                <w14:ligatures w14:val="standardContextual"/>
               </w:rPr>
               <w:tab/>
             </w:r>
@@ -535,7 +541,7 @@
                 <w:noProof/>
                 <w:webHidden/>
               </w:rPr>
-              <w:instrText xml:space="preserve"> PAGEREF _Toc72093736 \h </w:instrText>
+              <w:instrText xml:space="preserve"> PAGEREF _Toc232344651 \h </w:instrText>
             </w:r>
             <w:r>
               <w:rPr>
@@ -576,11 +582,14 @@
             <w:rPr>
               <w:rFonts w:eastAsiaTheme="minorEastAsia"/>
               <w:noProof/>
-              <w:sz w:val="22"/>
+              <w:kern w:val="2"/>
+              <w:sz w:val="24"/>
+              <w:szCs w:val="24"/>
               <w:lang w:eastAsia="de-DE"/>
+              <w14:ligatures w14:val="standardContextual"/>
             </w:rPr>
           </w:pPr>
-          <w:hyperlink w:anchor="_Toc72093737" w:history="1">
+          <w:hyperlink w:anchor="_Toc232344652" w:history="1">
             <w:r>
               <w:rPr>
                 <w:rStyle w:val="Hyperlink"/>
@@ -592,8 +601,11 @@
               <w:rPr>
                 <w:rFonts w:eastAsiaTheme="minorEastAsia"/>
                 <w:noProof/>
-                <w:sz w:val="22"/>
+                <w:kern w:val="2"/>
+                <w:sz w:val="24"/>
+                <w:szCs w:val="24"/>
                 <w:lang w:eastAsia="de-DE"/>
+                <w14:ligatures w14:val="standardContextual"/>
               </w:rPr>
               <w:tab/>
             </w:r>
@@ -623,7 +635,7 @@
                 <w:noProof/>
                 <w:webHidden/>
               </w:rPr>
-              <w:instrText xml:space="preserve"> PAGEREF _Toc72093737 \h </w:instrText>
+              <w:instrText xml:space="preserve"> PAGEREF _Toc232344652 \h </w:instrText>
             </w:r>
             <w:r>
               <w:rPr>
@@ -658,17 +670,20 @@
           <w:pPr>
             <w:pStyle w:val="Verzeichnis2"/>
             <w:tabs>
-              <w:tab w:val="left" w:pos="880"/>
+              <w:tab w:val="left" w:pos="720"/>
               <w:tab w:val="right" w:leader="dot" w:pos="9911"/>
             </w:tabs>
             <w:rPr>
               <w:rFonts w:eastAsiaTheme="minorEastAsia"/>
               <w:noProof/>
-              <w:sz w:val="22"/>
+              <w:kern w:val="2"/>
+              <w:sz w:val="24"/>
+              <w:szCs w:val="24"/>
               <w:lang w:eastAsia="de-DE"/>
+              <w14:ligatures w14:val="standardContextual"/>
             </w:rPr>
           </w:pPr>
-          <w:hyperlink w:anchor="_Toc72093738" w:history="1">
+          <w:hyperlink w:anchor="_Toc232344653" w:history="1">
             <w:r>
               <w:rPr>
                 <w:rStyle w:val="Hyperlink"/>
@@ -680,8 +695,11 @@
               <w:rPr>
                 <w:rFonts w:eastAsiaTheme="minorEastAsia"/>
                 <w:noProof/>
-                <w:sz w:val="22"/>
+                <w:kern w:val="2"/>
+                <w:sz w:val="24"/>
+                <w:szCs w:val="24"/>
                 <w:lang w:eastAsia="de-DE"/>
+                <w14:ligatures w14:val="standardContextual"/>
               </w:rPr>
               <w:tab/>
             </w:r>
@@ -711,7 +729,7 @@
                 <w:noProof/>
                 <w:webHidden/>
               </w:rPr>
-              <w:instrText xml:space="preserve"> PAGEREF _Toc72093738 \h </w:instrText>
+              <w:instrText xml:space="preserve"> PAGEREF _Toc232344653 \h </w:instrText>
             </w:r>
             <w:r>
               <w:rPr>
@@ -746,17 +764,20 @@
           <w:pPr>
             <w:pStyle w:val="Verzeichnis3"/>
             <w:tabs>
-              <w:tab w:val="left" w:pos="1100"/>
+              <w:tab w:val="left" w:pos="1200"/>
               <w:tab w:val="right" w:leader="dot" w:pos="9911"/>
             </w:tabs>
             <w:rPr>
               <w:rFonts w:eastAsiaTheme="minorEastAsia"/>
               <w:noProof/>
-              <w:sz w:val="22"/>
+              <w:kern w:val="2"/>
+              <w:sz w:val="24"/>
+              <w:szCs w:val="24"/>
               <w:lang w:eastAsia="de-DE"/>
+              <w14:ligatures w14:val="standardContextual"/>
             </w:rPr>
           </w:pPr>
-          <w:hyperlink w:anchor="_Toc72093739" w:history="1">
+          <w:hyperlink w:anchor="_Toc232344654" w:history="1">
             <w:r>
               <w:rPr>
                 <w:rStyle w:val="Hyperlink"/>
@@ -768,8 +789,11 @@
               <w:rPr>
                 <w:rFonts w:eastAsiaTheme="minorEastAsia"/>
                 <w:noProof/>
-                <w:sz w:val="22"/>
+                <w:kern w:val="2"/>
+                <w:sz w:val="24"/>
+                <w:szCs w:val="24"/>
                 <w:lang w:eastAsia="de-DE"/>
+                <w14:ligatures w14:val="standardContextual"/>
               </w:rPr>
               <w:tab/>
             </w:r>
@@ -799,7 +823,7 @@
                 <w:noProof/>
                 <w:webHidden/>
               </w:rPr>
-              <w:instrText xml:space="preserve"> PAGEREF _Toc72093739 \h </w:instrText>
+              <w:instrText xml:space="preserve"> PAGEREF _Toc232344654 \h </w:instrText>
             </w:r>
             <w:r>
               <w:rPr>
@@ -834,17 +858,20 @@
           <w:pPr>
             <w:pStyle w:val="Verzeichnis3"/>
             <w:tabs>
-              <w:tab w:val="left" w:pos="1100"/>
+              <w:tab w:val="left" w:pos="1200"/>
               <w:tab w:val="right" w:leader="dot" w:pos="9911"/>
             </w:tabs>
             <w:rPr>
               <w:rFonts w:eastAsiaTheme="minorEastAsia"/>
               <w:noProof/>
-              <w:sz w:val="22"/>
+              <w:kern w:val="2"/>
+              <w:sz w:val="24"/>
+              <w:szCs w:val="24"/>
               <w:lang w:eastAsia="de-DE"/>
+              <w14:ligatures w14:val="standardContextual"/>
             </w:rPr>
           </w:pPr>
-          <w:hyperlink w:anchor="_Toc72093740" w:history="1">
+          <w:hyperlink w:anchor="_Toc232344655" w:history="1">
             <w:r>
               <w:rPr>
                 <w:rStyle w:val="Hyperlink"/>
@@ -856,8 +883,11 @@
               <w:rPr>
                 <w:rFonts w:eastAsiaTheme="minorEastAsia"/>
                 <w:noProof/>
-                <w:sz w:val="22"/>
+                <w:kern w:val="2"/>
+                <w:sz w:val="24"/>
+                <w:szCs w:val="24"/>
                 <w:lang w:eastAsia="de-DE"/>
+                <w14:ligatures w14:val="standardContextual"/>
               </w:rPr>
               <w:tab/>
             </w:r>
@@ -887,7 +917,7 @@
                 <w:noProof/>
                 <w:webHidden/>
               </w:rPr>
-              <w:instrText xml:space="preserve"> PAGEREF _Toc72093740 \h </w:instrText>
+              <w:instrText xml:space="preserve"> PAGEREF _Toc232344655 \h </w:instrText>
             </w:r>
             <w:r>
               <w:rPr>
@@ -922,17 +952,20 @@
           <w:pPr>
             <w:pStyle w:val="Verzeichnis3"/>
             <w:tabs>
-              <w:tab w:val="left" w:pos="1100"/>
+              <w:tab w:val="left" w:pos="1200"/>
               <w:tab w:val="right" w:leader="dot" w:pos="9911"/>
             </w:tabs>
             <w:rPr>
               <w:rFonts w:eastAsiaTheme="minorEastAsia"/>
               <w:noProof/>
-              <w:sz w:val="22"/>
+              <w:kern w:val="2"/>
+              <w:sz w:val="24"/>
+              <w:szCs w:val="24"/>
               <w:lang w:eastAsia="de-DE"/>
+              <w14:ligatures w14:val="standardContextual"/>
             </w:rPr>
           </w:pPr>
-          <w:hyperlink w:anchor="_Toc72093741" w:history="1">
+          <w:hyperlink w:anchor="_Toc232344656" w:history="1">
             <w:r>
               <w:rPr>
                 <w:rStyle w:val="Hyperlink"/>
@@ -944,8 +977,11 @@
               <w:rPr>
                 <w:rFonts w:eastAsiaTheme="minorEastAsia"/>
                 <w:noProof/>
-                <w:sz w:val="22"/>
+                <w:kern w:val="2"/>
+                <w:sz w:val="24"/>
+                <w:szCs w:val="24"/>
                 <w:lang w:eastAsia="de-DE"/>
+                <w14:ligatures w14:val="standardContextual"/>
               </w:rPr>
               <w:tab/>
             </w:r>
@@ -975,7 +1011,7 @@
                 <w:noProof/>
                 <w:webHidden/>
               </w:rPr>
-              <w:instrText xml:space="preserve"> PAGEREF _Toc72093741 \h </w:instrText>
+              <w:instrText xml:space="preserve"> PAGEREF _Toc232344656 \h </w:instrText>
             </w:r>
             <w:r>
               <w:rPr>
@@ -1010,17 +1046,20 @@
           <w:pPr>
             <w:pStyle w:val="Verzeichnis3"/>
             <w:tabs>
-              <w:tab w:val="left" w:pos="1100"/>
+              <w:tab w:val="left" w:pos="1200"/>
               <w:tab w:val="right" w:leader="dot" w:pos="9911"/>
             </w:tabs>
             <w:rPr>
               <w:rFonts w:eastAsiaTheme="minorEastAsia"/>
               <w:noProof/>
-              <w:sz w:val="22"/>
+              <w:kern w:val="2"/>
+              <w:sz w:val="24"/>
+              <w:szCs w:val="24"/>
               <w:lang w:eastAsia="de-DE"/>
+              <w14:ligatures w14:val="standardContextual"/>
             </w:rPr>
           </w:pPr>
-          <w:hyperlink w:anchor="_Toc72093742" w:history="1">
+          <w:hyperlink w:anchor="_Toc232344657" w:history="1">
             <w:r>
               <w:rPr>
                 <w:rStyle w:val="Hyperlink"/>
@@ -1032,8 +1071,11 @@
               <w:rPr>
                 <w:rFonts w:eastAsiaTheme="minorEastAsia"/>
                 <w:noProof/>
-                <w:sz w:val="22"/>
+                <w:kern w:val="2"/>
+                <w:sz w:val="24"/>
+                <w:szCs w:val="24"/>
                 <w:lang w:eastAsia="de-DE"/>
+                <w14:ligatures w14:val="standardContextual"/>
               </w:rPr>
               <w:tab/>
             </w:r>
@@ -1063,7 +1105,7 @@
                 <w:noProof/>
                 <w:webHidden/>
               </w:rPr>
-              <w:instrText xml:space="preserve"> PAGEREF _Toc72093742 \h </w:instrText>
+              <w:instrText xml:space="preserve"> PAGEREF _Toc232344657 \h </w:instrText>
             </w:r>
             <w:r>
               <w:rPr>
@@ -1098,17 +1140,20 @@
           <w:pPr>
             <w:pStyle w:val="Verzeichnis3"/>
             <w:tabs>
-              <w:tab w:val="left" w:pos="1100"/>
+              <w:tab w:val="left" w:pos="1200"/>
               <w:tab w:val="right" w:leader="dot" w:pos="9911"/>
             </w:tabs>
             <w:rPr>
               <w:rFonts w:eastAsiaTheme="minorEastAsia"/>
               <w:noProof/>
-              <w:sz w:val="22"/>
+              <w:kern w:val="2"/>
+              <w:sz w:val="24"/>
+              <w:szCs w:val="24"/>
               <w:lang w:eastAsia="de-DE"/>
+              <w14:ligatures w14:val="standardContextual"/>
             </w:rPr>
           </w:pPr>
-          <w:hyperlink w:anchor="_Toc72093743" w:history="1">
+          <w:hyperlink w:anchor="_Toc232344658" w:history="1">
             <w:r>
               <w:rPr>
                 <w:rStyle w:val="Hyperlink"/>
@@ -1120,8 +1165,11 @@
               <w:rPr>
                 <w:rFonts w:eastAsiaTheme="minorEastAsia"/>
                 <w:noProof/>
-                <w:sz w:val="22"/>
+                <w:kern w:val="2"/>
+                <w:sz w:val="24"/>
+                <w:szCs w:val="24"/>
                 <w:lang w:eastAsia="de-DE"/>
+                <w14:ligatures w14:val="standardContextual"/>
               </w:rPr>
               <w:tab/>
             </w:r>
@@ -1151,7 +1199,7 @@
                 <w:noProof/>
                 <w:webHidden/>
               </w:rPr>
-              <w:instrText xml:space="preserve"> PAGEREF _Toc72093743 \h </w:instrText>
+              <w:instrText xml:space="preserve"> PAGEREF _Toc232344658 \h </w:instrText>
             </w:r>
             <w:r>
               <w:rPr>
@@ -1186,17 +1234,20 @@
           <w:pPr>
             <w:pStyle w:val="Verzeichnis2"/>
             <w:tabs>
-              <w:tab w:val="left" w:pos="880"/>
+              <w:tab w:val="left" w:pos="720"/>
               <w:tab w:val="right" w:leader="dot" w:pos="9911"/>
             </w:tabs>
             <w:rPr>
               <w:rFonts w:eastAsiaTheme="minorEastAsia"/>
               <w:noProof/>
-              <w:sz w:val="22"/>
+              <w:kern w:val="2"/>
+              <w:sz w:val="24"/>
+              <w:szCs w:val="24"/>
               <w:lang w:eastAsia="de-DE"/>
+              <w14:ligatures w14:val="standardContextual"/>
             </w:rPr>
           </w:pPr>
-          <w:hyperlink w:anchor="_Toc72093744" w:history="1">
+          <w:hyperlink w:anchor="_Toc232344659" w:history="1">
             <w:r>
               <w:rPr>
                 <w:rStyle w:val="Hyperlink"/>
@@ -1208,8 +1259,11 @@
               <w:rPr>
                 <w:rFonts w:eastAsiaTheme="minorEastAsia"/>
                 <w:noProof/>
-                <w:sz w:val="22"/>
+                <w:kern w:val="2"/>
+                <w:sz w:val="24"/>
+                <w:szCs w:val="24"/>
                 <w:lang w:eastAsia="de-DE"/>
+                <w14:ligatures w14:val="standardContextual"/>
               </w:rPr>
               <w:tab/>
             </w:r>
@@ -1239,7 +1293,7 @@
                 <w:noProof/>
                 <w:webHidden/>
               </w:rPr>
-              <w:instrText xml:space="preserve"> PAGEREF _Toc72093744 \h </w:instrText>
+              <w:instrText xml:space="preserve"> PAGEREF _Toc232344659 \h </w:instrText>
             </w:r>
             <w:r>
               <w:rPr>
@@ -1274,17 +1328,20 @@
           <w:pPr>
             <w:pStyle w:val="Verzeichnis2"/>
             <w:tabs>
-              <w:tab w:val="left" w:pos="880"/>
+              <w:tab w:val="left" w:pos="720"/>
               <w:tab w:val="right" w:leader="dot" w:pos="9911"/>
             </w:tabs>
             <w:rPr>
               <w:rFonts w:eastAsiaTheme="minorEastAsia"/>
               <w:noProof/>
-              <w:sz w:val="22"/>
+              <w:kern w:val="2"/>
+              <w:sz w:val="24"/>
+              <w:szCs w:val="24"/>
               <w:lang w:eastAsia="de-DE"/>
+              <w14:ligatures w14:val="standardContextual"/>
             </w:rPr>
           </w:pPr>
-          <w:hyperlink w:anchor="_Toc72093745" w:history="1">
+          <w:hyperlink w:anchor="_Toc232344660" w:history="1">
             <w:r>
               <w:rPr>
                 <w:rStyle w:val="Hyperlink"/>
@@ -1296,8 +1353,11 @@
               <w:rPr>
                 <w:rFonts w:eastAsiaTheme="minorEastAsia"/>
                 <w:noProof/>
-                <w:sz w:val="22"/>
+                <w:kern w:val="2"/>
+                <w:sz w:val="24"/>
+                <w:szCs w:val="24"/>
                 <w:lang w:eastAsia="de-DE"/>
+                <w14:ligatures w14:val="standardContextual"/>
               </w:rPr>
               <w:tab/>
             </w:r>
@@ -1327,7 +1387,7 @@
                 <w:noProof/>
                 <w:webHidden/>
               </w:rPr>
-              <w:instrText xml:space="preserve"> PAGEREF _Toc72093745 \h </w:instrText>
+              <w:instrText xml:space="preserve"> PAGEREF _Toc232344660 \h </w:instrText>
             </w:r>
             <w:r>
               <w:rPr>
@@ -1362,17 +1422,20 @@
           <w:pPr>
             <w:pStyle w:val="Verzeichnis3"/>
             <w:tabs>
-              <w:tab w:val="left" w:pos="1100"/>
+              <w:tab w:val="left" w:pos="1200"/>
               <w:tab w:val="right" w:leader="dot" w:pos="9911"/>
             </w:tabs>
             <w:rPr>
               <w:rFonts w:eastAsiaTheme="minorEastAsia"/>
               <w:noProof/>
-              <w:sz w:val="22"/>
+              <w:kern w:val="2"/>
+              <w:sz w:val="24"/>
+              <w:szCs w:val="24"/>
               <w:lang w:eastAsia="de-DE"/>
+              <w14:ligatures w14:val="standardContextual"/>
             </w:rPr>
           </w:pPr>
-          <w:hyperlink w:anchor="_Toc72093746" w:history="1">
+          <w:hyperlink w:anchor="_Toc232344661" w:history="1">
             <w:r>
               <w:rPr>
                 <w:rStyle w:val="Hyperlink"/>
@@ -1384,8 +1447,11 @@
               <w:rPr>
                 <w:rFonts w:eastAsiaTheme="minorEastAsia"/>
                 <w:noProof/>
-                <w:sz w:val="22"/>
+                <w:kern w:val="2"/>
+                <w:sz w:val="24"/>
+                <w:szCs w:val="24"/>
                 <w:lang w:eastAsia="de-DE"/>
+                <w14:ligatures w14:val="standardContextual"/>
               </w:rPr>
               <w:tab/>
             </w:r>
@@ -1415,7 +1481,7 @@
                 <w:noProof/>
                 <w:webHidden/>
               </w:rPr>
-              <w:instrText xml:space="preserve"> PAGEREF _Toc72093746 \h </w:instrText>
+              <w:instrText xml:space="preserve"> PAGEREF _Toc232344661 \h </w:instrText>
             </w:r>
             <w:r>
               <w:rPr>
@@ -1450,17 +1516,20 @@
           <w:pPr>
             <w:pStyle w:val="Verzeichnis3"/>
             <w:tabs>
-              <w:tab w:val="left" w:pos="1100"/>
+              <w:tab w:val="left" w:pos="1200"/>
               <w:tab w:val="right" w:leader="dot" w:pos="9911"/>
             </w:tabs>
             <w:rPr>
               <w:rFonts w:eastAsiaTheme="minorEastAsia"/>
               <w:noProof/>
-              <w:sz w:val="22"/>
+              <w:kern w:val="2"/>
+              <w:sz w:val="24"/>
+              <w:szCs w:val="24"/>
               <w:lang w:eastAsia="de-DE"/>
+              <w14:ligatures w14:val="standardContextual"/>
             </w:rPr>
           </w:pPr>
-          <w:hyperlink w:anchor="_Toc72093747" w:history="1">
+          <w:hyperlink w:anchor="_Toc232344662" w:history="1">
             <w:r>
               <w:rPr>
                 <w:rStyle w:val="Hyperlink"/>
@@ -1472,8 +1541,11 @@
               <w:rPr>
                 <w:rFonts w:eastAsiaTheme="minorEastAsia"/>
                 <w:noProof/>
-                <w:sz w:val="22"/>
+                <w:kern w:val="2"/>
+                <w:sz w:val="24"/>
+                <w:szCs w:val="24"/>
                 <w:lang w:eastAsia="de-DE"/>
+                <w14:ligatures w14:val="standardContextual"/>
               </w:rPr>
               <w:tab/>
             </w:r>
@@ -1503,7 +1575,7 @@
                 <w:noProof/>
                 <w:webHidden/>
               </w:rPr>
-              <w:instrText xml:space="preserve"> PAGEREF _Toc72093747 \h </w:instrText>
+              <w:instrText xml:space="preserve"> PAGEREF _Toc232344662 \h </w:instrText>
             </w:r>
             <w:r>
               <w:rPr>
@@ -1538,17 +1610,20 @@
           <w:pPr>
             <w:pStyle w:val="Verzeichnis2"/>
             <w:tabs>
-              <w:tab w:val="left" w:pos="880"/>
+              <w:tab w:val="left" w:pos="720"/>
               <w:tab w:val="right" w:leader="dot" w:pos="9911"/>
             </w:tabs>
             <w:rPr>
               <w:rFonts w:eastAsiaTheme="minorEastAsia"/>
               <w:noProof/>
-              <w:sz w:val="22"/>
+              <w:kern w:val="2"/>
+              <w:sz w:val="24"/>
+              <w:szCs w:val="24"/>
               <w:lang w:eastAsia="de-DE"/>
+              <w14:ligatures w14:val="standardContextual"/>
             </w:rPr>
           </w:pPr>
-          <w:hyperlink w:anchor="_Toc72093748" w:history="1">
+          <w:hyperlink w:anchor="_Toc232344663" w:history="1">
             <w:r>
               <w:rPr>
                 <w:rStyle w:val="Hyperlink"/>
@@ -1560,8 +1635,11 @@
               <w:rPr>
                 <w:rFonts w:eastAsiaTheme="minorEastAsia"/>
                 <w:noProof/>
-                <w:sz w:val="22"/>
+                <w:kern w:val="2"/>
+                <w:sz w:val="24"/>
+                <w:szCs w:val="24"/>
                 <w:lang w:eastAsia="de-DE"/>
+                <w14:ligatures w14:val="standardContextual"/>
               </w:rPr>
               <w:tab/>
             </w:r>
@@ -1591,7 +1669,7 @@
                 <w:noProof/>
                 <w:webHidden/>
               </w:rPr>
-              <w:instrText xml:space="preserve"> PAGEREF _Toc72093748 \h </w:instrText>
+              <w:instrText xml:space="preserve"> PAGEREF _Toc232344663 \h </w:instrText>
             </w:r>
             <w:r>
               <w:rPr>
@@ -1632,11 +1710,14 @@
             <w:rPr>
               <w:rFonts w:eastAsiaTheme="minorEastAsia"/>
               <w:noProof/>
-              <w:sz w:val="22"/>
+              <w:kern w:val="2"/>
+              <w:sz w:val="24"/>
+              <w:szCs w:val="24"/>
               <w:lang w:eastAsia="de-DE"/>
+              <w14:ligatures w14:val="standardContextual"/>
             </w:rPr>
           </w:pPr>
-          <w:hyperlink w:anchor="_Toc72093749" w:history="1">
+          <w:hyperlink w:anchor="_Toc232344664" w:history="1">
             <w:r>
               <w:rPr>
                 <w:rStyle w:val="Hyperlink"/>
@@ -1648,8 +1729,11 @@
               <w:rPr>
                 <w:rFonts w:eastAsiaTheme="minorEastAsia"/>
                 <w:noProof/>
-                <w:sz w:val="22"/>
+                <w:kern w:val="2"/>
+                <w:sz w:val="24"/>
+                <w:szCs w:val="24"/>
                 <w:lang w:eastAsia="de-DE"/>
+                <w14:ligatures w14:val="standardContextual"/>
               </w:rPr>
               <w:tab/>
             </w:r>
@@ -1679,7 +1763,7 @@
                 <w:noProof/>
                 <w:webHidden/>
               </w:rPr>
-              <w:instrText xml:space="preserve"> PAGEREF _Toc72093749 \h </w:instrText>
+              <w:instrText xml:space="preserve"> PAGEREF _Toc232344664 \h </w:instrText>
             </w:r>
             <w:r>
               <w:rPr>
@@ -1714,17 +1798,20 @@
           <w:pPr>
             <w:pStyle w:val="Verzeichnis2"/>
             <w:tabs>
-              <w:tab w:val="left" w:pos="880"/>
+              <w:tab w:val="left" w:pos="720"/>
               <w:tab w:val="right" w:leader="dot" w:pos="9911"/>
             </w:tabs>
             <w:rPr>
               <w:rFonts w:eastAsiaTheme="minorEastAsia"/>
               <w:noProof/>
-              <w:sz w:val="22"/>
+              <w:kern w:val="2"/>
+              <w:sz w:val="24"/>
+              <w:szCs w:val="24"/>
               <w:lang w:eastAsia="de-DE"/>
+              <w14:ligatures w14:val="standardContextual"/>
             </w:rPr>
           </w:pPr>
-          <w:hyperlink w:anchor="_Toc72093750" w:history="1">
+          <w:hyperlink w:anchor="_Toc232344665" w:history="1">
             <w:r>
               <w:rPr>
                 <w:rStyle w:val="Hyperlink"/>
@@ -1736,8 +1823,11 @@
               <w:rPr>
                 <w:rFonts w:eastAsiaTheme="minorEastAsia"/>
                 <w:noProof/>
-                <w:sz w:val="22"/>
+                <w:kern w:val="2"/>
+                <w:sz w:val="24"/>
+                <w:szCs w:val="24"/>
                 <w:lang w:eastAsia="de-DE"/>
+                <w14:ligatures w14:val="standardContextual"/>
               </w:rPr>
               <w:tab/>
             </w:r>
@@ -1767,7 +1857,7 @@
                 <w:noProof/>
                 <w:webHidden/>
               </w:rPr>
-              <w:instrText xml:space="preserve"> PAGEREF _Toc72093750 \h </w:instrText>
+              <w:instrText xml:space="preserve"> PAGEREF _Toc232344665 \h </w:instrText>
             </w:r>
             <w:r>
               <w:rPr>
@@ -1802,17 +1892,20 @@
           <w:pPr>
             <w:pStyle w:val="Verzeichnis2"/>
             <w:tabs>
-              <w:tab w:val="left" w:pos="880"/>
+              <w:tab w:val="left" w:pos="720"/>
               <w:tab w:val="right" w:leader="dot" w:pos="9911"/>
             </w:tabs>
             <w:rPr>
               <w:rFonts w:eastAsiaTheme="minorEastAsia"/>
               <w:noProof/>
-              <w:sz w:val="22"/>
+              <w:kern w:val="2"/>
+              <w:sz w:val="24"/>
+              <w:szCs w:val="24"/>
               <w:lang w:eastAsia="de-DE"/>
+              <w14:ligatures w14:val="standardContextual"/>
             </w:rPr>
           </w:pPr>
-          <w:hyperlink w:anchor="_Toc72093751" w:history="1">
+          <w:hyperlink w:anchor="_Toc232344666" w:history="1">
             <w:r>
               <w:rPr>
                 <w:rStyle w:val="Hyperlink"/>
@@ -1824,8 +1917,11 @@
               <w:rPr>
                 <w:rFonts w:eastAsiaTheme="minorEastAsia"/>
                 <w:noProof/>
-                <w:sz w:val="22"/>
+                <w:kern w:val="2"/>
+                <w:sz w:val="24"/>
+                <w:szCs w:val="24"/>
                 <w:lang w:eastAsia="de-DE"/>
+                <w14:ligatures w14:val="standardContextual"/>
               </w:rPr>
               <w:tab/>
             </w:r>
@@ -1855,7 +1951,7 @@
                 <w:noProof/>
                 <w:webHidden/>
               </w:rPr>
-              <w:instrText xml:space="preserve"> PAGEREF _Toc72093751 \h </w:instrText>
+              <w:instrText xml:space="preserve"> PAGEREF _Toc232344666 \h </w:instrText>
             </w:r>
             <w:r>
               <w:rPr>
@@ -1890,17 +1986,20 @@
           <w:pPr>
             <w:pStyle w:val="Verzeichnis2"/>
             <w:tabs>
-              <w:tab w:val="left" w:pos="880"/>
+              <w:tab w:val="left" w:pos="720"/>
               <w:tab w:val="right" w:leader="dot" w:pos="9911"/>
             </w:tabs>
             <w:rPr>
               <w:rFonts w:eastAsiaTheme="minorEastAsia"/>
               <w:noProof/>
-              <w:sz w:val="22"/>
+              <w:kern w:val="2"/>
+              <w:sz w:val="24"/>
+              <w:szCs w:val="24"/>
               <w:lang w:eastAsia="de-DE"/>
+              <w14:ligatures w14:val="standardContextual"/>
             </w:rPr>
           </w:pPr>
-          <w:hyperlink w:anchor="_Toc72093752" w:history="1">
+          <w:hyperlink w:anchor="_Toc232344667" w:history="1">
             <w:r>
               <w:rPr>
                 <w:rStyle w:val="Hyperlink"/>
@@ -1912,8 +2011,11 @@
               <w:rPr>
                 <w:rFonts w:eastAsiaTheme="minorEastAsia"/>
                 <w:noProof/>
-                <w:sz w:val="22"/>
+                <w:kern w:val="2"/>
+                <w:sz w:val="24"/>
+                <w:szCs w:val="24"/>
                 <w:lang w:eastAsia="de-DE"/>
+                <w14:ligatures w14:val="standardContextual"/>
               </w:rPr>
               <w:tab/>
             </w:r>
@@ -1943,7 +2045,7 @@
                 <w:noProof/>
                 <w:webHidden/>
               </w:rPr>
-              <w:instrText xml:space="preserve"> PAGEREF _Toc72093752 \h </w:instrText>
+              <w:instrText xml:space="preserve"> PAGEREF _Toc232344667 \h </w:instrText>
             </w:r>
             <w:r>
               <w:rPr>
@@ -1978,17 +2080,20 @@
           <w:pPr>
             <w:pStyle w:val="Verzeichnis2"/>
             <w:tabs>
-              <w:tab w:val="left" w:pos="880"/>
+              <w:tab w:val="left" w:pos="720"/>
               <w:tab w:val="right" w:leader="dot" w:pos="9911"/>
             </w:tabs>
             <w:rPr>
               <w:rFonts w:eastAsiaTheme="minorEastAsia"/>
               <w:noProof/>
-              <w:sz w:val="22"/>
+              <w:kern w:val="2"/>
+              <w:sz w:val="24"/>
+              <w:szCs w:val="24"/>
               <w:lang w:eastAsia="de-DE"/>
+              <w14:ligatures w14:val="standardContextual"/>
             </w:rPr>
           </w:pPr>
-          <w:hyperlink w:anchor="_Toc72093753" w:history="1">
+          <w:hyperlink w:anchor="_Toc232344668" w:history="1">
             <w:r>
               <w:rPr>
                 <w:rStyle w:val="Hyperlink"/>
@@ -2000,8 +2105,11 @@
               <w:rPr>
                 <w:rFonts w:eastAsiaTheme="minorEastAsia"/>
                 <w:noProof/>
-                <w:sz w:val="22"/>
+                <w:kern w:val="2"/>
+                <w:sz w:val="24"/>
+                <w:szCs w:val="24"/>
                 <w:lang w:eastAsia="de-DE"/>
+                <w14:ligatures w14:val="standardContextual"/>
               </w:rPr>
               <w:tab/>
             </w:r>
@@ -2031,7 +2139,7 @@
                 <w:noProof/>
                 <w:webHidden/>
               </w:rPr>
-              <w:instrText xml:space="preserve"> PAGEREF _Toc72093753 \h </w:instrText>
+              <w:instrText xml:space="preserve"> PAGEREF _Toc232344668 \h </w:instrText>
             </w:r>
             <w:r>
               <w:rPr>
@@ -2072,11 +2180,14 @@
             <w:rPr>
               <w:rFonts w:eastAsiaTheme="minorEastAsia"/>
               <w:noProof/>
-              <w:sz w:val="22"/>
+              <w:kern w:val="2"/>
+              <w:sz w:val="24"/>
+              <w:szCs w:val="24"/>
               <w:lang w:eastAsia="de-DE"/>
+              <w14:ligatures w14:val="standardContextual"/>
             </w:rPr>
           </w:pPr>
-          <w:hyperlink w:anchor="_Toc72093754" w:history="1">
+          <w:hyperlink w:anchor="_Toc232344669" w:history="1">
             <w:r>
               <w:rPr>
                 <w:rStyle w:val="Hyperlink"/>
@@ -2088,8 +2199,11 @@
               <w:rPr>
                 <w:rFonts w:eastAsiaTheme="minorEastAsia"/>
                 <w:noProof/>
-                <w:sz w:val="22"/>
+                <w:kern w:val="2"/>
+                <w:sz w:val="24"/>
+                <w:szCs w:val="24"/>
                 <w:lang w:eastAsia="de-DE"/>
+                <w14:ligatures w14:val="standardContextual"/>
               </w:rPr>
               <w:tab/>
             </w:r>
@@ -2119,7 +2233,7 @@
                 <w:noProof/>
                 <w:webHidden/>
               </w:rPr>
-              <w:instrText xml:space="preserve"> PAGEREF _Toc72093754 \h </w:instrText>
+              <w:instrText xml:space="preserve"> PAGEREF _Toc232344669 \h </w:instrText>
             </w:r>
             <w:r>
               <w:rPr>
@@ -2154,17 +2268,20 @@
           <w:pPr>
             <w:pStyle w:val="Verzeichnis3"/>
             <w:tabs>
-              <w:tab w:val="left" w:pos="1100"/>
+              <w:tab w:val="left" w:pos="1200"/>
               <w:tab w:val="right" w:leader="dot" w:pos="9911"/>
             </w:tabs>
             <w:rPr>
               <w:rFonts w:eastAsiaTheme="minorEastAsia"/>
               <w:noProof/>
-              <w:sz w:val="22"/>
+              <w:kern w:val="2"/>
+              <w:sz w:val="24"/>
+              <w:szCs w:val="24"/>
               <w:lang w:eastAsia="de-DE"/>
+              <w14:ligatures w14:val="standardContextual"/>
             </w:rPr>
           </w:pPr>
-          <w:hyperlink w:anchor="_Toc72093755" w:history="1">
+          <w:hyperlink w:anchor="_Toc232344670" w:history="1">
             <w:r>
               <w:rPr>
                 <w:rStyle w:val="Hyperlink"/>
@@ -2176,8 +2293,11 @@
               <w:rPr>
                 <w:rFonts w:eastAsiaTheme="minorEastAsia"/>
                 <w:noProof/>
-                <w:sz w:val="22"/>
+                <w:kern w:val="2"/>
+                <w:sz w:val="24"/>
+                <w:szCs w:val="24"/>
                 <w:lang w:eastAsia="de-DE"/>
+                <w14:ligatures w14:val="standardContextual"/>
               </w:rPr>
               <w:tab/>
             </w:r>
@@ -2207,7 +2327,7 @@
                 <w:noProof/>
                 <w:webHidden/>
               </w:rPr>
-              <w:instrText xml:space="preserve"> PAGEREF _Toc72093755 \h </w:instrText>
+              <w:instrText xml:space="preserve"> PAGEREF _Toc232344670 \h </w:instrText>
             </w:r>
             <w:r>
               <w:rPr>
@@ -2242,17 +2362,20 @@
           <w:pPr>
             <w:pStyle w:val="Verzeichnis3"/>
             <w:tabs>
-              <w:tab w:val="left" w:pos="1100"/>
+              <w:tab w:val="left" w:pos="1200"/>
               <w:tab w:val="right" w:leader="dot" w:pos="9911"/>
             </w:tabs>
             <w:rPr>
               <w:rFonts w:eastAsiaTheme="minorEastAsia"/>
               <w:noProof/>
-              <w:sz w:val="22"/>
+              <w:kern w:val="2"/>
+              <w:sz w:val="24"/>
+              <w:szCs w:val="24"/>
               <w:lang w:eastAsia="de-DE"/>
+              <w14:ligatures w14:val="standardContextual"/>
             </w:rPr>
           </w:pPr>
-          <w:hyperlink w:anchor="_Toc72093756" w:history="1">
+          <w:hyperlink w:anchor="_Toc232344671" w:history="1">
             <w:r>
               <w:rPr>
                 <w:rStyle w:val="Hyperlink"/>
@@ -2264,8 +2387,11 @@
               <w:rPr>
                 <w:rFonts w:eastAsiaTheme="minorEastAsia"/>
                 <w:noProof/>
-                <w:sz w:val="22"/>
+                <w:kern w:val="2"/>
+                <w:sz w:val="24"/>
+                <w:szCs w:val="24"/>
                 <w:lang w:eastAsia="de-DE"/>
+                <w14:ligatures w14:val="standardContextual"/>
               </w:rPr>
               <w:tab/>
             </w:r>
@@ -2295,7 +2421,7 @@
                 <w:noProof/>
                 <w:webHidden/>
               </w:rPr>
-              <w:instrText xml:space="preserve"> PAGEREF _Toc72093756 \h </w:instrText>
+              <w:instrText xml:space="preserve"> PAGEREF _Toc232344671 \h </w:instrText>
             </w:r>
             <w:r>
               <w:rPr>
@@ -2330,17 +2456,20 @@
           <w:pPr>
             <w:pStyle w:val="Verzeichnis3"/>
             <w:tabs>
-              <w:tab w:val="left" w:pos="1100"/>
+              <w:tab w:val="left" w:pos="1200"/>
               <w:tab w:val="right" w:leader="dot" w:pos="9911"/>
             </w:tabs>
             <w:rPr>
               <w:rFonts w:eastAsiaTheme="minorEastAsia"/>
               <w:noProof/>
-              <w:sz w:val="22"/>
+              <w:kern w:val="2"/>
+              <w:sz w:val="24"/>
+              <w:szCs w:val="24"/>
               <w:lang w:eastAsia="de-DE"/>
+              <w14:ligatures w14:val="standardContextual"/>
             </w:rPr>
           </w:pPr>
-          <w:hyperlink w:anchor="_Toc72093757" w:history="1">
+          <w:hyperlink w:anchor="_Toc232344672" w:history="1">
             <w:r>
               <w:rPr>
                 <w:rStyle w:val="Hyperlink"/>
@@ -2352,8 +2481,11 @@
               <w:rPr>
                 <w:rFonts w:eastAsiaTheme="minorEastAsia"/>
                 <w:noProof/>
-                <w:sz w:val="22"/>
+                <w:kern w:val="2"/>
+                <w:sz w:val="24"/>
+                <w:szCs w:val="24"/>
                 <w:lang w:eastAsia="de-DE"/>
+                <w14:ligatures w14:val="standardContextual"/>
               </w:rPr>
               <w:tab/>
             </w:r>
@@ -2383,7 +2515,7 @@
                 <w:noProof/>
                 <w:webHidden/>
               </w:rPr>
-              <w:instrText xml:space="preserve"> PAGEREF _Toc72093757 \h </w:instrText>
+              <w:instrText xml:space="preserve"> PAGEREF _Toc232344672 \h </w:instrText>
             </w:r>
             <w:r>
               <w:rPr>
@@ -2418,17 +2550,20 @@
           <w:pPr>
             <w:pStyle w:val="Verzeichnis3"/>
             <w:tabs>
-              <w:tab w:val="left" w:pos="1100"/>
+              <w:tab w:val="left" w:pos="1200"/>
               <w:tab w:val="right" w:leader="dot" w:pos="9911"/>
             </w:tabs>
             <w:rPr>
               <w:rFonts w:eastAsiaTheme="minorEastAsia"/>
               <w:noProof/>
-              <w:sz w:val="22"/>
+              <w:kern w:val="2"/>
+              <w:sz w:val="24"/>
+              <w:szCs w:val="24"/>
               <w:lang w:eastAsia="de-DE"/>
+              <w14:ligatures w14:val="standardContextual"/>
             </w:rPr>
           </w:pPr>
-          <w:hyperlink w:anchor="_Toc72093758" w:history="1">
+          <w:hyperlink w:anchor="_Toc232344673" w:history="1">
             <w:r>
               <w:rPr>
                 <w:rStyle w:val="Hyperlink"/>
@@ -2440,8 +2575,11 @@
               <w:rPr>
                 <w:rFonts w:eastAsiaTheme="minorEastAsia"/>
                 <w:noProof/>
-                <w:sz w:val="22"/>
+                <w:kern w:val="2"/>
+                <w:sz w:val="24"/>
+                <w:szCs w:val="24"/>
                 <w:lang w:eastAsia="de-DE"/>
+                <w14:ligatures w14:val="standardContextual"/>
               </w:rPr>
               <w:tab/>
             </w:r>
@@ -2471,7 +2609,7 @@
                 <w:noProof/>
                 <w:webHidden/>
               </w:rPr>
-              <w:instrText xml:space="preserve"> PAGEREF _Toc72093758 \h </w:instrText>
+              <w:instrText xml:space="preserve"> PAGEREF _Toc232344673 \h </w:instrText>
             </w:r>
             <w:r>
               <w:rPr>
@@ -2506,17 +2644,20 @@
           <w:pPr>
             <w:pStyle w:val="Verzeichnis2"/>
             <w:tabs>
-              <w:tab w:val="left" w:pos="880"/>
+              <w:tab w:val="left" w:pos="720"/>
               <w:tab w:val="right" w:leader="dot" w:pos="9911"/>
             </w:tabs>
             <w:rPr>
               <w:rFonts w:eastAsiaTheme="minorEastAsia"/>
               <w:noProof/>
-              <w:sz w:val="22"/>
+              <w:kern w:val="2"/>
+              <w:sz w:val="24"/>
+              <w:szCs w:val="24"/>
               <w:lang w:eastAsia="de-DE"/>
+              <w14:ligatures w14:val="standardContextual"/>
             </w:rPr>
           </w:pPr>
-          <w:hyperlink w:anchor="_Toc72093759" w:history="1">
+          <w:hyperlink w:anchor="_Toc232344674" w:history="1">
             <w:r>
               <w:rPr>
                 <w:rStyle w:val="Hyperlink"/>
@@ -2528,8 +2669,11 @@
               <w:rPr>
                 <w:rFonts w:eastAsiaTheme="minorEastAsia"/>
                 <w:noProof/>
-                <w:sz w:val="22"/>
+                <w:kern w:val="2"/>
+                <w:sz w:val="24"/>
+                <w:szCs w:val="24"/>
                 <w:lang w:eastAsia="de-DE"/>
+                <w14:ligatures w14:val="standardContextual"/>
               </w:rPr>
               <w:tab/>
             </w:r>
@@ -2559,7 +2703,7 @@
                 <w:noProof/>
                 <w:webHidden/>
               </w:rPr>
-              <w:instrText xml:space="preserve"> PAGEREF _Toc72093759 \h </w:instrText>
+              <w:instrText xml:space="preserve"> PAGEREF _Toc232344674 \h </w:instrText>
             </w:r>
             <w:r>
               <w:rPr>
@@ -2594,17 +2738,20 @@
           <w:pPr>
             <w:pStyle w:val="Verzeichnis3"/>
             <w:tabs>
-              <w:tab w:val="left" w:pos="1100"/>
+              <w:tab w:val="left" w:pos="1200"/>
               <w:tab w:val="right" w:leader="dot" w:pos="9911"/>
             </w:tabs>
             <w:rPr>
               <w:rFonts w:eastAsiaTheme="minorEastAsia"/>
               <w:noProof/>
-              <w:sz w:val="22"/>
+              <w:kern w:val="2"/>
+              <w:sz w:val="24"/>
+              <w:szCs w:val="24"/>
               <w:lang w:eastAsia="de-DE"/>
+              <w14:ligatures w14:val="standardContextual"/>
             </w:rPr>
           </w:pPr>
-          <w:hyperlink w:anchor="_Toc72093760" w:history="1">
+          <w:hyperlink w:anchor="_Toc232344675" w:history="1">
             <w:r>
               <w:rPr>
                 <w:rStyle w:val="Hyperlink"/>
@@ -2616,8 +2763,11 @@
               <w:rPr>
                 <w:rFonts w:eastAsiaTheme="minorEastAsia"/>
                 <w:noProof/>
-                <w:sz w:val="22"/>
+                <w:kern w:val="2"/>
+                <w:sz w:val="24"/>
+                <w:szCs w:val="24"/>
                 <w:lang w:eastAsia="de-DE"/>
+                <w14:ligatures w14:val="standardContextual"/>
               </w:rPr>
               <w:tab/>
             </w:r>
@@ -2647,7 +2797,7 @@
                 <w:noProof/>
                 <w:webHidden/>
               </w:rPr>
-              <w:instrText xml:space="preserve"> PAGEREF _Toc72093760 \h </w:instrText>
+              <w:instrText xml:space="preserve"> PAGEREF _Toc232344675 \h </w:instrText>
             </w:r>
             <w:r>
               <w:rPr>
@@ -2682,17 +2832,20 @@
           <w:pPr>
             <w:pStyle w:val="Verzeichnis3"/>
             <w:tabs>
-              <w:tab w:val="left" w:pos="1100"/>
+              <w:tab w:val="left" w:pos="1200"/>
               <w:tab w:val="right" w:leader="dot" w:pos="9911"/>
             </w:tabs>
             <w:rPr>
               <w:rFonts w:eastAsiaTheme="minorEastAsia"/>
               <w:noProof/>
-              <w:sz w:val="22"/>
+              <w:kern w:val="2"/>
+              <w:sz w:val="24"/>
+              <w:szCs w:val="24"/>
               <w:lang w:eastAsia="de-DE"/>
+              <w14:ligatures w14:val="standardContextual"/>
             </w:rPr>
           </w:pPr>
-          <w:hyperlink w:anchor="_Toc72093761" w:history="1">
+          <w:hyperlink w:anchor="_Toc232344676" w:history="1">
             <w:r>
               <w:rPr>
                 <w:rStyle w:val="Hyperlink"/>
@@ -2704,8 +2857,11 @@
               <w:rPr>
                 <w:rFonts w:eastAsiaTheme="minorEastAsia"/>
                 <w:noProof/>
-                <w:sz w:val="22"/>
+                <w:kern w:val="2"/>
+                <w:sz w:val="24"/>
+                <w:szCs w:val="24"/>
                 <w:lang w:eastAsia="de-DE"/>
+                <w14:ligatures w14:val="standardContextual"/>
               </w:rPr>
               <w:tab/>
             </w:r>
@@ -2735,7 +2891,7 @@
                 <w:noProof/>
                 <w:webHidden/>
               </w:rPr>
-              <w:instrText xml:space="preserve"> PAGEREF _Toc72093761 \h </w:instrText>
+              <w:instrText xml:space="preserve"> PAGEREF _Toc232344676 \h </w:instrText>
             </w:r>
             <w:r>
               <w:rPr>
@@ -2770,17 +2926,20 @@
           <w:pPr>
             <w:pStyle w:val="Verzeichnis3"/>
             <w:tabs>
-              <w:tab w:val="left" w:pos="1100"/>
+              <w:tab w:val="left" w:pos="1200"/>
               <w:tab w:val="right" w:leader="dot" w:pos="9911"/>
             </w:tabs>
             <w:rPr>
               <w:rFonts w:eastAsiaTheme="minorEastAsia"/>
               <w:noProof/>
-              <w:sz w:val="22"/>
+              <w:kern w:val="2"/>
+              <w:sz w:val="24"/>
+              <w:szCs w:val="24"/>
               <w:lang w:eastAsia="de-DE"/>
+              <w14:ligatures w14:val="standardContextual"/>
             </w:rPr>
           </w:pPr>
-          <w:hyperlink w:anchor="_Toc72093762" w:history="1">
+          <w:hyperlink w:anchor="_Toc232344677" w:history="1">
             <w:r>
               <w:rPr>
                 <w:rStyle w:val="Hyperlink"/>
@@ -2792,8 +2951,11 @@
               <w:rPr>
                 <w:rFonts w:eastAsiaTheme="minorEastAsia"/>
                 <w:noProof/>
-                <w:sz w:val="22"/>
+                <w:kern w:val="2"/>
+                <w:sz w:val="24"/>
+                <w:szCs w:val="24"/>
                 <w:lang w:eastAsia="de-DE"/>
+                <w14:ligatures w14:val="standardContextual"/>
               </w:rPr>
               <w:tab/>
             </w:r>
@@ -2823,7 +2985,7 @@
                 <w:noProof/>
                 <w:webHidden/>
               </w:rPr>
-              <w:instrText xml:space="preserve"> PAGEREF _Toc72093762 \h </w:instrText>
+              <w:instrText xml:space="preserve"> PAGEREF _Toc232344677 \h </w:instrText>
             </w:r>
             <w:r>
               <w:rPr>
@@ -2858,17 +3020,20 @@
           <w:pPr>
             <w:pStyle w:val="Verzeichnis3"/>
             <w:tabs>
-              <w:tab w:val="left" w:pos="1100"/>
+              <w:tab w:val="left" w:pos="1200"/>
               <w:tab w:val="right" w:leader="dot" w:pos="9911"/>
             </w:tabs>
             <w:rPr>
               <w:rFonts w:eastAsiaTheme="minorEastAsia"/>
               <w:noProof/>
-              <w:sz w:val="22"/>
+              <w:kern w:val="2"/>
+              <w:sz w:val="24"/>
+              <w:szCs w:val="24"/>
               <w:lang w:eastAsia="de-DE"/>
+              <w14:ligatures w14:val="standardContextual"/>
             </w:rPr>
           </w:pPr>
-          <w:hyperlink w:anchor="_Toc72093763" w:history="1">
+          <w:hyperlink w:anchor="_Toc232344678" w:history="1">
             <w:r>
               <w:rPr>
                 <w:rStyle w:val="Hyperlink"/>
@@ -2880,8 +3045,11 @@
               <w:rPr>
                 <w:rFonts w:eastAsiaTheme="minorEastAsia"/>
                 <w:noProof/>
-                <w:sz w:val="22"/>
+                <w:kern w:val="2"/>
+                <w:sz w:val="24"/>
+                <w:szCs w:val="24"/>
                 <w:lang w:eastAsia="de-DE"/>
+                <w14:ligatures w14:val="standardContextual"/>
               </w:rPr>
               <w:tab/>
             </w:r>
@@ -2911,7 +3079,7 @@
                 <w:noProof/>
                 <w:webHidden/>
               </w:rPr>
-              <w:instrText xml:space="preserve"> PAGEREF _Toc72093763 \h </w:instrText>
+              <w:instrText xml:space="preserve"> PAGEREF _Toc232344678 \h </w:instrText>
             </w:r>
             <w:r>
               <w:rPr>
@@ -2952,11 +3120,14 @@
             <w:rPr>
               <w:rFonts w:eastAsiaTheme="minorEastAsia"/>
               <w:noProof/>
-              <w:sz w:val="22"/>
+              <w:kern w:val="2"/>
+              <w:sz w:val="24"/>
+              <w:szCs w:val="24"/>
               <w:lang w:eastAsia="de-DE"/>
+              <w14:ligatures w14:val="standardContextual"/>
             </w:rPr>
           </w:pPr>
-          <w:hyperlink w:anchor="_Toc72093764" w:history="1">
+          <w:hyperlink w:anchor="_Toc232344679" w:history="1">
             <w:r>
               <w:rPr>
                 <w:rStyle w:val="Hyperlink"/>
@@ -2968,8 +3139,11 @@
               <w:rPr>
                 <w:rFonts w:eastAsiaTheme="minorEastAsia"/>
                 <w:noProof/>
-                <w:sz w:val="22"/>
+                <w:kern w:val="2"/>
+                <w:sz w:val="24"/>
+                <w:szCs w:val="24"/>
                 <w:lang w:eastAsia="de-DE"/>
+                <w14:ligatures w14:val="standardContextual"/>
               </w:rPr>
               <w:tab/>
             </w:r>
@@ -2999,7 +3173,7 @@
                 <w:noProof/>
                 <w:webHidden/>
               </w:rPr>
-              <w:instrText xml:space="preserve"> PAGEREF _Toc72093764 \h </w:instrText>
+              <w:instrText xml:space="preserve"> PAGEREF _Toc232344679 \h </w:instrText>
             </w:r>
             <w:r>
               <w:rPr>
@@ -3034,17 +3208,20 @@
           <w:pPr>
             <w:pStyle w:val="Verzeichnis2"/>
             <w:tabs>
-              <w:tab w:val="left" w:pos="880"/>
+              <w:tab w:val="left" w:pos="720"/>
               <w:tab w:val="right" w:leader="dot" w:pos="9911"/>
             </w:tabs>
             <w:rPr>
               <w:rFonts w:eastAsiaTheme="minorEastAsia"/>
               <w:noProof/>
-              <w:sz w:val="22"/>
+              <w:kern w:val="2"/>
+              <w:sz w:val="24"/>
+              <w:szCs w:val="24"/>
               <w:lang w:eastAsia="de-DE"/>
+              <w14:ligatures w14:val="standardContextual"/>
             </w:rPr>
           </w:pPr>
-          <w:hyperlink w:anchor="_Toc72093765" w:history="1">
+          <w:hyperlink w:anchor="_Toc232344680" w:history="1">
             <w:r>
               <w:rPr>
                 <w:rStyle w:val="Hyperlink"/>
@@ -3056,8 +3233,11 @@
               <w:rPr>
                 <w:rFonts w:eastAsiaTheme="minorEastAsia"/>
                 <w:noProof/>
-                <w:sz w:val="22"/>
+                <w:kern w:val="2"/>
+                <w:sz w:val="24"/>
+                <w:szCs w:val="24"/>
                 <w:lang w:eastAsia="de-DE"/>
+                <w14:ligatures w14:val="standardContextual"/>
               </w:rPr>
               <w:tab/>
             </w:r>
@@ -3087,7 +3267,7 @@
                 <w:noProof/>
                 <w:webHidden/>
               </w:rPr>
-              <w:instrText xml:space="preserve"> PAGEREF _Toc72093765 \h </w:instrText>
+              <w:instrText xml:space="preserve"> PAGEREF _Toc232344680 \h </w:instrText>
             </w:r>
             <w:r>
               <w:rPr>
@@ -3122,17 +3302,20 @@
           <w:pPr>
             <w:pStyle w:val="Verzeichnis2"/>
             <w:tabs>
-              <w:tab w:val="left" w:pos="880"/>
+              <w:tab w:val="left" w:pos="720"/>
               <w:tab w:val="right" w:leader="dot" w:pos="9911"/>
             </w:tabs>
             <w:rPr>
               <w:rFonts w:eastAsiaTheme="minorEastAsia"/>
               <w:noProof/>
-              <w:sz w:val="22"/>
+              <w:kern w:val="2"/>
+              <w:sz w:val="24"/>
+              <w:szCs w:val="24"/>
               <w:lang w:eastAsia="de-DE"/>
+              <w14:ligatures w14:val="standardContextual"/>
             </w:rPr>
           </w:pPr>
-          <w:hyperlink w:anchor="_Toc72093766" w:history="1">
+          <w:hyperlink w:anchor="_Toc232344681" w:history="1">
             <w:r>
               <w:rPr>
                 <w:rStyle w:val="Hyperlink"/>
@@ -3144,8 +3327,11 @@
               <w:rPr>
                 <w:rFonts w:eastAsiaTheme="minorEastAsia"/>
                 <w:noProof/>
-                <w:sz w:val="22"/>
+                <w:kern w:val="2"/>
+                <w:sz w:val="24"/>
+                <w:szCs w:val="24"/>
                 <w:lang w:eastAsia="de-DE"/>
+                <w14:ligatures w14:val="standardContextual"/>
               </w:rPr>
               <w:tab/>
             </w:r>
@@ -3175,7 +3361,7 @@
                 <w:noProof/>
                 <w:webHidden/>
               </w:rPr>
-              <w:instrText xml:space="preserve"> PAGEREF _Toc72093766 \h </w:instrText>
+              <w:instrText xml:space="preserve"> PAGEREF _Toc232344681 \h </w:instrText>
             </w:r>
             <w:r>
               <w:rPr>
@@ -3210,17 +3396,20 @@
           <w:pPr>
             <w:pStyle w:val="Verzeichnis2"/>
             <w:tabs>
-              <w:tab w:val="left" w:pos="880"/>
+              <w:tab w:val="left" w:pos="720"/>
               <w:tab w:val="right" w:leader="dot" w:pos="9911"/>
             </w:tabs>
             <w:rPr>
               <w:rFonts w:eastAsiaTheme="minorEastAsia"/>
               <w:noProof/>
-              <w:sz w:val="22"/>
+              <w:kern w:val="2"/>
+              <w:sz w:val="24"/>
+              <w:szCs w:val="24"/>
               <w:lang w:eastAsia="de-DE"/>
+              <w14:ligatures w14:val="standardContextual"/>
             </w:rPr>
           </w:pPr>
-          <w:hyperlink w:anchor="_Toc72093767" w:history="1">
+          <w:hyperlink w:anchor="_Toc232344682" w:history="1">
             <w:r>
               <w:rPr>
                 <w:rStyle w:val="Hyperlink"/>
@@ -3232,8 +3421,11 @@
               <w:rPr>
                 <w:rFonts w:eastAsiaTheme="minorEastAsia"/>
                 <w:noProof/>
-                <w:sz w:val="22"/>
+                <w:kern w:val="2"/>
+                <w:sz w:val="24"/>
+                <w:szCs w:val="24"/>
                 <w:lang w:eastAsia="de-DE"/>
+                <w14:ligatures w14:val="standardContextual"/>
               </w:rPr>
               <w:tab/>
             </w:r>
@@ -3263,7 +3455,7 @@
                 <w:noProof/>
                 <w:webHidden/>
               </w:rPr>
-              <w:instrText xml:space="preserve"> PAGEREF _Toc72093767 \h </w:instrText>
+              <w:instrText xml:space="preserve"> PAGEREF _Toc232344682 \h </w:instrText>
             </w:r>
             <w:r>
               <w:rPr>
@@ -3298,17 +3490,20 @@
           <w:pPr>
             <w:pStyle w:val="Verzeichnis2"/>
             <w:tabs>
-              <w:tab w:val="left" w:pos="880"/>
+              <w:tab w:val="left" w:pos="720"/>
               <w:tab w:val="right" w:leader="dot" w:pos="9911"/>
             </w:tabs>
             <w:rPr>
               <w:rFonts w:eastAsiaTheme="minorEastAsia"/>
               <w:noProof/>
-              <w:sz w:val="22"/>
+              <w:kern w:val="2"/>
+              <w:sz w:val="24"/>
+              <w:szCs w:val="24"/>
               <w:lang w:eastAsia="de-DE"/>
+              <w14:ligatures w14:val="standardContextual"/>
             </w:rPr>
           </w:pPr>
-          <w:hyperlink w:anchor="_Toc72093768" w:history="1">
+          <w:hyperlink w:anchor="_Toc232344683" w:history="1">
             <w:r>
               <w:rPr>
                 <w:rStyle w:val="Hyperlink"/>
@@ -3320,8 +3515,11 @@
               <w:rPr>
                 <w:rFonts w:eastAsiaTheme="minorEastAsia"/>
                 <w:noProof/>
-                <w:sz w:val="22"/>
+                <w:kern w:val="2"/>
+                <w:sz w:val="24"/>
+                <w:szCs w:val="24"/>
                 <w:lang w:eastAsia="de-DE"/>
+                <w14:ligatures w14:val="standardContextual"/>
               </w:rPr>
               <w:tab/>
             </w:r>
@@ -3351,7 +3549,7 @@
                 <w:noProof/>
                 <w:webHidden/>
               </w:rPr>
-              <w:instrText xml:space="preserve"> PAGEREF _Toc72093768 \h </w:instrText>
+              <w:instrText xml:space="preserve"> PAGEREF _Toc232344683 \h </w:instrText>
             </w:r>
             <w:r>
               <w:rPr>
@@ -3386,17 +3584,20 @@
           <w:pPr>
             <w:pStyle w:val="Verzeichnis2"/>
             <w:tabs>
-              <w:tab w:val="left" w:pos="880"/>
+              <w:tab w:val="left" w:pos="720"/>
               <w:tab w:val="right" w:leader="dot" w:pos="9911"/>
             </w:tabs>
             <w:rPr>
               <w:rFonts w:eastAsiaTheme="minorEastAsia"/>
               <w:noProof/>
-              <w:sz w:val="22"/>
+              <w:kern w:val="2"/>
+              <w:sz w:val="24"/>
+              <w:szCs w:val="24"/>
               <w:lang w:eastAsia="de-DE"/>
+              <w14:ligatures w14:val="standardContextual"/>
             </w:rPr>
           </w:pPr>
-          <w:hyperlink w:anchor="_Toc72093769" w:history="1">
+          <w:hyperlink w:anchor="_Toc232344684" w:history="1">
             <w:r>
               <w:rPr>
                 <w:rStyle w:val="Hyperlink"/>
@@ -3408,8 +3609,11 @@
               <w:rPr>
                 <w:rFonts w:eastAsiaTheme="minorEastAsia"/>
                 <w:noProof/>
-                <w:sz w:val="22"/>
+                <w:kern w:val="2"/>
+                <w:sz w:val="24"/>
+                <w:szCs w:val="24"/>
                 <w:lang w:eastAsia="de-DE"/>
+                <w14:ligatures w14:val="standardContextual"/>
               </w:rPr>
               <w:tab/>
             </w:r>
@@ -3439,7 +3643,7 @@
                 <w:noProof/>
                 <w:webHidden/>
               </w:rPr>
-              <w:instrText xml:space="preserve"> PAGEREF _Toc72093769 \h </w:instrText>
+              <w:instrText xml:space="preserve"> PAGEREF _Toc232344684 \h </w:instrText>
             </w:r>
             <w:r>
               <w:rPr>
@@ -3474,17 +3678,20 @@
           <w:pPr>
             <w:pStyle w:val="Verzeichnis2"/>
             <w:tabs>
-              <w:tab w:val="left" w:pos="880"/>
+              <w:tab w:val="left" w:pos="720"/>
               <w:tab w:val="right" w:leader="dot" w:pos="9911"/>
             </w:tabs>
             <w:rPr>
               <w:rFonts w:eastAsiaTheme="minorEastAsia"/>
               <w:noProof/>
-              <w:sz w:val="22"/>
+              <w:kern w:val="2"/>
+              <w:sz w:val="24"/>
+              <w:szCs w:val="24"/>
               <w:lang w:eastAsia="de-DE"/>
+              <w14:ligatures w14:val="standardContextual"/>
             </w:rPr>
           </w:pPr>
-          <w:hyperlink w:anchor="_Toc72093770" w:history="1">
+          <w:hyperlink w:anchor="_Toc232344685" w:history="1">
             <w:r>
               <w:rPr>
                 <w:rStyle w:val="Hyperlink"/>
@@ -3496,8 +3703,11 @@
               <w:rPr>
                 <w:rFonts w:eastAsiaTheme="minorEastAsia"/>
                 <w:noProof/>
-                <w:sz w:val="22"/>
+                <w:kern w:val="2"/>
+                <w:sz w:val="24"/>
+                <w:szCs w:val="24"/>
                 <w:lang w:eastAsia="de-DE"/>
+                <w14:ligatures w14:val="standardContextual"/>
               </w:rPr>
               <w:tab/>
             </w:r>
@@ -3527,7 +3737,7 @@
                 <w:noProof/>
                 <w:webHidden/>
               </w:rPr>
-              <w:instrText xml:space="preserve"> PAGEREF _Toc72093770 \h </w:instrText>
+              <w:instrText xml:space="preserve"> PAGEREF _Toc232344685 \h </w:instrText>
             </w:r>
             <w:r>
               <w:rPr>
@@ -3562,17 +3772,20 @@
           <w:pPr>
             <w:pStyle w:val="Verzeichnis3"/>
             <w:tabs>
-              <w:tab w:val="left" w:pos="1100"/>
+              <w:tab w:val="left" w:pos="1200"/>
               <w:tab w:val="right" w:leader="dot" w:pos="9911"/>
             </w:tabs>
             <w:rPr>
               <w:rFonts w:eastAsiaTheme="minorEastAsia"/>
               <w:noProof/>
-              <w:sz w:val="22"/>
+              <w:kern w:val="2"/>
+              <w:sz w:val="24"/>
+              <w:szCs w:val="24"/>
               <w:lang w:eastAsia="de-DE"/>
+              <w14:ligatures w14:val="standardContextual"/>
             </w:rPr>
           </w:pPr>
-          <w:hyperlink w:anchor="_Toc72093771" w:history="1">
+          <w:hyperlink w:anchor="_Toc232344686" w:history="1">
             <w:r>
               <w:rPr>
                 <w:rStyle w:val="Hyperlink"/>
@@ -3584,8 +3797,11 @@
               <w:rPr>
                 <w:rFonts w:eastAsiaTheme="minorEastAsia"/>
                 <w:noProof/>
-                <w:sz w:val="22"/>
+                <w:kern w:val="2"/>
+                <w:sz w:val="24"/>
+                <w:szCs w:val="24"/>
                 <w:lang w:eastAsia="de-DE"/>
+                <w14:ligatures w14:val="standardContextual"/>
               </w:rPr>
               <w:tab/>
             </w:r>
@@ -3615,7 +3831,7 @@
                 <w:noProof/>
                 <w:webHidden/>
               </w:rPr>
-              <w:instrText xml:space="preserve"> PAGEREF _Toc72093771 \h </w:instrText>
+              <w:instrText xml:space="preserve"> PAGEREF _Toc232344686 \h </w:instrText>
             </w:r>
             <w:r>
               <w:rPr>
@@ -3650,17 +3866,20 @@
           <w:pPr>
             <w:pStyle w:val="Verzeichnis3"/>
             <w:tabs>
-              <w:tab w:val="left" w:pos="1100"/>
+              <w:tab w:val="left" w:pos="1200"/>
               <w:tab w:val="right" w:leader="dot" w:pos="9911"/>
             </w:tabs>
             <w:rPr>
               <w:rFonts w:eastAsiaTheme="minorEastAsia"/>
               <w:noProof/>
-              <w:sz w:val="22"/>
+              <w:kern w:val="2"/>
+              <w:sz w:val="24"/>
+              <w:szCs w:val="24"/>
               <w:lang w:eastAsia="de-DE"/>
+              <w14:ligatures w14:val="standardContextual"/>
             </w:rPr>
           </w:pPr>
-          <w:hyperlink w:anchor="_Toc72093772" w:history="1">
+          <w:hyperlink w:anchor="_Toc232344687" w:history="1">
             <w:r>
               <w:rPr>
                 <w:rStyle w:val="Hyperlink"/>
@@ -3672,8 +3891,11 @@
               <w:rPr>
                 <w:rFonts w:eastAsiaTheme="minorEastAsia"/>
                 <w:noProof/>
-                <w:sz w:val="22"/>
+                <w:kern w:val="2"/>
+                <w:sz w:val="24"/>
+                <w:szCs w:val="24"/>
                 <w:lang w:eastAsia="de-DE"/>
+                <w14:ligatures w14:val="standardContextual"/>
               </w:rPr>
               <w:tab/>
             </w:r>
@@ -3703,7 +3925,7 @@
                 <w:noProof/>
                 <w:webHidden/>
               </w:rPr>
-              <w:instrText xml:space="preserve"> PAGEREF _Toc72093772 \h </w:instrText>
+              <w:instrText xml:space="preserve"> PAGEREF _Toc232344687 \h </w:instrText>
             </w:r>
             <w:r>
               <w:rPr>
@@ -3738,17 +3960,20 @@
           <w:pPr>
             <w:pStyle w:val="Verzeichnis2"/>
             <w:tabs>
-              <w:tab w:val="left" w:pos="880"/>
+              <w:tab w:val="left" w:pos="720"/>
               <w:tab w:val="right" w:leader="dot" w:pos="9911"/>
             </w:tabs>
             <w:rPr>
               <w:rFonts w:eastAsiaTheme="minorEastAsia"/>
               <w:noProof/>
-              <w:sz w:val="22"/>
+              <w:kern w:val="2"/>
+              <w:sz w:val="24"/>
+              <w:szCs w:val="24"/>
               <w:lang w:eastAsia="de-DE"/>
+              <w14:ligatures w14:val="standardContextual"/>
             </w:rPr>
           </w:pPr>
-          <w:hyperlink w:anchor="_Toc72093773" w:history="1">
+          <w:hyperlink w:anchor="_Toc232344688" w:history="1">
             <w:r>
               <w:rPr>
                 <w:rStyle w:val="Hyperlink"/>
@@ -3760,8 +3985,11 @@
               <w:rPr>
                 <w:rFonts w:eastAsiaTheme="minorEastAsia"/>
                 <w:noProof/>
-                <w:sz w:val="22"/>
+                <w:kern w:val="2"/>
+                <w:sz w:val="24"/>
+                <w:szCs w:val="24"/>
                 <w:lang w:eastAsia="de-DE"/>
+                <w14:ligatures w14:val="standardContextual"/>
               </w:rPr>
               <w:tab/>
             </w:r>
@@ -3791,7 +4019,7 @@
                 <w:noProof/>
                 <w:webHidden/>
               </w:rPr>
-              <w:instrText xml:space="preserve"> PAGEREF _Toc72093773 \h </w:instrText>
+              <w:instrText xml:space="preserve"> PAGEREF _Toc232344688 \h </w:instrText>
             </w:r>
             <w:r>
               <w:rPr>
@@ -3826,17 +4054,20 @@
           <w:pPr>
             <w:pStyle w:val="Verzeichnis3"/>
             <w:tabs>
-              <w:tab w:val="left" w:pos="1100"/>
+              <w:tab w:val="left" w:pos="1200"/>
               <w:tab w:val="right" w:leader="dot" w:pos="9911"/>
             </w:tabs>
             <w:rPr>
               <w:rFonts w:eastAsiaTheme="minorEastAsia"/>
               <w:noProof/>
-              <w:sz w:val="22"/>
+              <w:kern w:val="2"/>
+              <w:sz w:val="24"/>
+              <w:szCs w:val="24"/>
               <w:lang w:eastAsia="de-DE"/>
+              <w14:ligatures w14:val="standardContextual"/>
             </w:rPr>
           </w:pPr>
-          <w:hyperlink w:anchor="_Toc72093774" w:history="1">
+          <w:hyperlink w:anchor="_Toc232344689" w:history="1">
             <w:r>
               <w:rPr>
                 <w:rStyle w:val="Hyperlink"/>
@@ -3848,8 +4079,11 @@
               <w:rPr>
                 <w:rFonts w:eastAsiaTheme="minorEastAsia"/>
                 <w:noProof/>
-                <w:sz w:val="22"/>
+                <w:kern w:val="2"/>
+                <w:sz w:val="24"/>
+                <w:szCs w:val="24"/>
                 <w:lang w:eastAsia="de-DE"/>
+                <w14:ligatures w14:val="standardContextual"/>
               </w:rPr>
               <w:tab/>
             </w:r>
@@ -3879,7 +4113,7 @@
                 <w:noProof/>
                 <w:webHidden/>
               </w:rPr>
-              <w:instrText xml:space="preserve"> PAGEREF _Toc72093774 \h </w:instrText>
+              <w:instrText xml:space="preserve"> PAGEREF _Toc232344689 \h </w:instrText>
             </w:r>
             <w:r>
               <w:rPr>
@@ -3914,17 +4148,20 @@
           <w:pPr>
             <w:pStyle w:val="Verzeichnis3"/>
             <w:tabs>
-              <w:tab w:val="left" w:pos="1100"/>
+              <w:tab w:val="left" w:pos="1200"/>
               <w:tab w:val="right" w:leader="dot" w:pos="9911"/>
             </w:tabs>
             <w:rPr>
               <w:rFonts w:eastAsiaTheme="minorEastAsia"/>
               <w:noProof/>
-              <w:sz w:val="22"/>
+              <w:kern w:val="2"/>
+              <w:sz w:val="24"/>
+              <w:szCs w:val="24"/>
               <w:lang w:eastAsia="de-DE"/>
+              <w14:ligatures w14:val="standardContextual"/>
             </w:rPr>
           </w:pPr>
-          <w:hyperlink w:anchor="_Toc72093775" w:history="1">
+          <w:hyperlink w:anchor="_Toc232344690" w:history="1">
             <w:r>
               <w:rPr>
                 <w:rStyle w:val="Hyperlink"/>
@@ -3936,8 +4173,11 @@
               <w:rPr>
                 <w:rFonts w:eastAsiaTheme="minorEastAsia"/>
                 <w:noProof/>
-                <w:sz w:val="22"/>
+                <w:kern w:val="2"/>
+                <w:sz w:val="24"/>
+                <w:szCs w:val="24"/>
                 <w:lang w:eastAsia="de-DE"/>
+                <w14:ligatures w14:val="standardContextual"/>
               </w:rPr>
               <w:tab/>
             </w:r>
@@ -3967,7 +4207,7 @@
                 <w:noProof/>
                 <w:webHidden/>
               </w:rPr>
-              <w:instrText xml:space="preserve"> PAGEREF _Toc72093775 \h </w:instrText>
+              <w:instrText xml:space="preserve"> PAGEREF _Toc232344690 \h </w:instrText>
             </w:r>
             <w:r>
               <w:rPr>
@@ -4002,17 +4242,20 @@
           <w:pPr>
             <w:pStyle w:val="Verzeichnis3"/>
             <w:tabs>
-              <w:tab w:val="left" w:pos="1100"/>
+              <w:tab w:val="left" w:pos="1200"/>
               <w:tab w:val="right" w:leader="dot" w:pos="9911"/>
             </w:tabs>
             <w:rPr>
               <w:rFonts w:eastAsiaTheme="minorEastAsia"/>
               <w:noProof/>
-              <w:sz w:val="22"/>
+              <w:kern w:val="2"/>
+              <w:sz w:val="24"/>
+              <w:szCs w:val="24"/>
               <w:lang w:eastAsia="de-DE"/>
+              <w14:ligatures w14:val="standardContextual"/>
             </w:rPr>
           </w:pPr>
-          <w:hyperlink w:anchor="_Toc72093776" w:history="1">
+          <w:hyperlink w:anchor="_Toc232344691" w:history="1">
             <w:r>
               <w:rPr>
                 <w:rStyle w:val="Hyperlink"/>
@@ -4024,8 +4267,11 @@
               <w:rPr>
                 <w:rFonts w:eastAsiaTheme="minorEastAsia"/>
                 <w:noProof/>
-                <w:sz w:val="22"/>
+                <w:kern w:val="2"/>
+                <w:sz w:val="24"/>
+                <w:szCs w:val="24"/>
                 <w:lang w:eastAsia="de-DE"/>
+                <w14:ligatures w14:val="standardContextual"/>
               </w:rPr>
               <w:tab/>
             </w:r>
@@ -4055,7 +4301,7 @@
                 <w:noProof/>
                 <w:webHidden/>
               </w:rPr>
-              <w:instrText xml:space="preserve"> PAGEREF _Toc72093776 \h </w:instrText>
+              <w:instrText xml:space="preserve"> PAGEREF _Toc232344691 \h </w:instrText>
             </w:r>
             <w:r>
               <w:rPr>
@@ -4090,17 +4336,20 @@
           <w:pPr>
             <w:pStyle w:val="Verzeichnis2"/>
             <w:tabs>
-              <w:tab w:val="left" w:pos="880"/>
+              <w:tab w:val="left" w:pos="720"/>
               <w:tab w:val="right" w:leader="dot" w:pos="9911"/>
             </w:tabs>
             <w:rPr>
               <w:rFonts w:eastAsiaTheme="minorEastAsia"/>
               <w:noProof/>
-              <w:sz w:val="22"/>
+              <w:kern w:val="2"/>
+              <w:sz w:val="24"/>
+              <w:szCs w:val="24"/>
               <w:lang w:eastAsia="de-DE"/>
+              <w14:ligatures w14:val="standardContextual"/>
             </w:rPr>
           </w:pPr>
-          <w:hyperlink w:anchor="_Toc72093777" w:history="1">
+          <w:hyperlink w:anchor="_Toc232344692" w:history="1">
             <w:r>
               <w:rPr>
                 <w:rStyle w:val="Hyperlink"/>
@@ -4112,8 +4361,11 @@
               <w:rPr>
                 <w:rFonts w:eastAsiaTheme="minorEastAsia"/>
                 <w:noProof/>
-                <w:sz w:val="22"/>
+                <w:kern w:val="2"/>
+                <w:sz w:val="24"/>
+                <w:szCs w:val="24"/>
                 <w:lang w:eastAsia="de-DE"/>
+                <w14:ligatures w14:val="standardContextual"/>
               </w:rPr>
               <w:tab/>
             </w:r>
@@ -4143,7 +4395,7 @@
                 <w:noProof/>
                 <w:webHidden/>
               </w:rPr>
-              <w:instrText xml:space="preserve"> PAGEREF _Toc72093777 \h </w:instrText>
+              <w:instrText xml:space="preserve"> PAGEREF _Toc232344692 \h </w:instrText>
             </w:r>
             <w:r>
               <w:rPr>
@@ -4178,17 +4430,20 @@
           <w:pPr>
             <w:pStyle w:val="Verzeichnis2"/>
             <w:tabs>
-              <w:tab w:val="left" w:pos="880"/>
+              <w:tab w:val="left" w:pos="720"/>
               <w:tab w:val="right" w:leader="dot" w:pos="9911"/>
             </w:tabs>
             <w:rPr>
               <w:rFonts w:eastAsiaTheme="minorEastAsia"/>
               <w:noProof/>
-              <w:sz w:val="22"/>
+              <w:kern w:val="2"/>
+              <w:sz w:val="24"/>
+              <w:szCs w:val="24"/>
               <w:lang w:eastAsia="de-DE"/>
+              <w14:ligatures w14:val="standardContextual"/>
             </w:rPr>
           </w:pPr>
-          <w:hyperlink w:anchor="_Toc72093778" w:history="1">
+          <w:hyperlink w:anchor="_Toc232344693" w:history="1">
             <w:r>
               <w:rPr>
                 <w:rStyle w:val="Hyperlink"/>
@@ -4200,8 +4455,11 @@
               <w:rPr>
                 <w:rFonts w:eastAsiaTheme="minorEastAsia"/>
                 <w:noProof/>
-                <w:sz w:val="22"/>
+                <w:kern w:val="2"/>
+                <w:sz w:val="24"/>
+                <w:szCs w:val="24"/>
                 <w:lang w:eastAsia="de-DE"/>
+                <w14:ligatures w14:val="standardContextual"/>
               </w:rPr>
               <w:tab/>
             </w:r>
@@ -4231,7 +4489,7 @@
                 <w:noProof/>
                 <w:webHidden/>
               </w:rPr>
-              <w:instrText xml:space="preserve"> PAGEREF _Toc72093778 \h </w:instrText>
+              <w:instrText xml:space="preserve"> PAGEREF _Toc232344693 \h </w:instrText>
             </w:r>
             <w:r>
               <w:rPr>
@@ -4272,11 +4530,14 @@
             <w:rPr>
               <w:rFonts w:eastAsiaTheme="minorEastAsia"/>
               <w:noProof/>
-              <w:sz w:val="22"/>
+              <w:kern w:val="2"/>
+              <w:sz w:val="24"/>
+              <w:szCs w:val="24"/>
               <w:lang w:eastAsia="de-DE"/>
+              <w14:ligatures w14:val="standardContextual"/>
             </w:rPr>
           </w:pPr>
-          <w:hyperlink w:anchor="_Toc72093779" w:history="1">
+          <w:hyperlink w:anchor="_Toc232344694" w:history="1">
             <w:r>
               <w:rPr>
                 <w:rStyle w:val="Hyperlink"/>
@@ -4288,8 +4549,11 @@
               <w:rPr>
                 <w:rFonts w:eastAsiaTheme="minorEastAsia"/>
                 <w:noProof/>
-                <w:sz w:val="22"/>
+                <w:kern w:val="2"/>
+                <w:sz w:val="24"/>
+                <w:szCs w:val="24"/>
                 <w:lang w:eastAsia="de-DE"/>
+                <w14:ligatures w14:val="standardContextual"/>
               </w:rPr>
               <w:tab/>
             </w:r>
@@ -4319,7 +4583,7 @@
                 <w:noProof/>
                 <w:webHidden/>
               </w:rPr>
-              <w:instrText xml:space="preserve"> PAGEREF _Toc72093779 \h </w:instrText>
+              <w:instrText xml:space="preserve"> PAGEREF _Toc232344694 \h </w:instrText>
             </w:r>
             <w:r>
               <w:rPr>
@@ -4354,17 +4618,20 @@
           <w:pPr>
             <w:pStyle w:val="Verzeichnis2"/>
             <w:tabs>
-              <w:tab w:val="left" w:pos="880"/>
+              <w:tab w:val="left" w:pos="720"/>
               <w:tab w:val="right" w:leader="dot" w:pos="9911"/>
             </w:tabs>
             <w:rPr>
               <w:rFonts w:eastAsiaTheme="minorEastAsia"/>
               <w:noProof/>
-              <w:sz w:val="22"/>
+              <w:kern w:val="2"/>
+              <w:sz w:val="24"/>
+              <w:szCs w:val="24"/>
               <w:lang w:eastAsia="de-DE"/>
+              <w14:ligatures w14:val="standardContextual"/>
             </w:rPr>
           </w:pPr>
-          <w:hyperlink w:anchor="_Toc72093780" w:history="1">
+          <w:hyperlink w:anchor="_Toc232344695" w:history="1">
             <w:r>
               <w:rPr>
                 <w:rStyle w:val="Hyperlink"/>
@@ -4376,8 +4643,11 @@
               <w:rPr>
                 <w:rFonts w:eastAsiaTheme="minorEastAsia"/>
                 <w:noProof/>
-                <w:sz w:val="22"/>
+                <w:kern w:val="2"/>
+                <w:sz w:val="24"/>
+                <w:szCs w:val="24"/>
                 <w:lang w:eastAsia="de-DE"/>
+                <w14:ligatures w14:val="standardContextual"/>
               </w:rPr>
               <w:tab/>
             </w:r>
@@ -4407,7 +4677,7 @@
                 <w:noProof/>
                 <w:webHidden/>
               </w:rPr>
-              <w:instrText xml:space="preserve"> PAGEREF _Toc72093780 \h </w:instrText>
+              <w:instrText xml:space="preserve"> PAGEREF _Toc232344695 \h </w:instrText>
             </w:r>
             <w:r>
               <w:rPr>
@@ -4442,17 +4712,20 @@
           <w:pPr>
             <w:pStyle w:val="Verzeichnis2"/>
             <w:tabs>
-              <w:tab w:val="left" w:pos="880"/>
+              <w:tab w:val="left" w:pos="720"/>
               <w:tab w:val="right" w:leader="dot" w:pos="9911"/>
             </w:tabs>
             <w:rPr>
               <w:rFonts w:eastAsiaTheme="minorEastAsia"/>
               <w:noProof/>
-              <w:sz w:val="22"/>
+              <w:kern w:val="2"/>
+              <w:sz w:val="24"/>
+              <w:szCs w:val="24"/>
               <w:lang w:eastAsia="de-DE"/>
+              <w14:ligatures w14:val="standardContextual"/>
             </w:rPr>
           </w:pPr>
-          <w:hyperlink w:anchor="_Toc72093781" w:history="1">
+          <w:hyperlink w:anchor="_Toc232344696" w:history="1">
             <w:r>
               <w:rPr>
                 <w:rStyle w:val="Hyperlink"/>
@@ -4464,8 +4737,11 @@
               <w:rPr>
                 <w:rFonts w:eastAsiaTheme="minorEastAsia"/>
                 <w:noProof/>
-                <w:sz w:val="22"/>
+                <w:kern w:val="2"/>
+                <w:sz w:val="24"/>
+                <w:szCs w:val="24"/>
                 <w:lang w:eastAsia="de-DE"/>
+                <w14:ligatures w14:val="standardContextual"/>
               </w:rPr>
               <w:tab/>
             </w:r>
@@ -4495,7 +4771,7 @@
                 <w:noProof/>
                 <w:webHidden/>
               </w:rPr>
-              <w:instrText xml:space="preserve"> PAGEREF _Toc72093781 \h </w:instrText>
+              <w:instrText xml:space="preserve"> PAGEREF _Toc232344696 \h </w:instrText>
             </w:r>
             <w:r>
               <w:rPr>
@@ -4530,17 +4806,20 @@
           <w:pPr>
             <w:pStyle w:val="Verzeichnis2"/>
             <w:tabs>
-              <w:tab w:val="left" w:pos="880"/>
+              <w:tab w:val="left" w:pos="720"/>
               <w:tab w:val="right" w:leader="dot" w:pos="9911"/>
             </w:tabs>
             <w:rPr>
               <w:rFonts w:eastAsiaTheme="minorEastAsia"/>
               <w:noProof/>
-              <w:sz w:val="22"/>
+              <w:kern w:val="2"/>
+              <w:sz w:val="24"/>
+              <w:szCs w:val="24"/>
               <w:lang w:eastAsia="de-DE"/>
+              <w14:ligatures w14:val="standardContextual"/>
             </w:rPr>
           </w:pPr>
-          <w:hyperlink w:anchor="_Toc72093782" w:history="1">
+          <w:hyperlink w:anchor="_Toc232344697" w:history="1">
             <w:r>
               <w:rPr>
                 <w:rStyle w:val="Hyperlink"/>
@@ -4552,8 +4831,11 @@
               <w:rPr>
                 <w:rFonts w:eastAsiaTheme="minorEastAsia"/>
                 <w:noProof/>
-                <w:sz w:val="22"/>
+                <w:kern w:val="2"/>
+                <w:sz w:val="24"/>
+                <w:szCs w:val="24"/>
                 <w:lang w:eastAsia="de-DE"/>
+                <w14:ligatures w14:val="standardContextual"/>
               </w:rPr>
               <w:tab/>
             </w:r>
@@ -4583,7 +4865,7 @@
                 <w:noProof/>
                 <w:webHidden/>
               </w:rPr>
-              <w:instrText xml:space="preserve"> PAGEREF _Toc72093782 \h </w:instrText>
+              <w:instrText xml:space="preserve"> PAGEREF _Toc232344697 \h </w:instrText>
             </w:r>
             <w:r>
               <w:rPr>
@@ -4618,17 +4900,20 @@
           <w:pPr>
             <w:pStyle w:val="Verzeichnis2"/>
             <w:tabs>
-              <w:tab w:val="left" w:pos="880"/>
+              <w:tab w:val="left" w:pos="720"/>
               <w:tab w:val="right" w:leader="dot" w:pos="9911"/>
             </w:tabs>
             <w:rPr>
               <w:rFonts w:eastAsiaTheme="minorEastAsia"/>
               <w:noProof/>
-              <w:sz w:val="22"/>
+              <w:kern w:val="2"/>
+              <w:sz w:val="24"/>
+              <w:szCs w:val="24"/>
               <w:lang w:eastAsia="de-DE"/>
+              <w14:ligatures w14:val="standardContextual"/>
             </w:rPr>
           </w:pPr>
-          <w:hyperlink w:anchor="_Toc72093783" w:history="1">
+          <w:hyperlink w:anchor="_Toc232344698" w:history="1">
             <w:r>
               <w:rPr>
                 <w:rStyle w:val="Hyperlink"/>
@@ -4640,8 +4925,11 @@
               <w:rPr>
                 <w:rFonts w:eastAsiaTheme="minorEastAsia"/>
                 <w:noProof/>
-                <w:sz w:val="22"/>
+                <w:kern w:val="2"/>
+                <w:sz w:val="24"/>
+                <w:szCs w:val="24"/>
                 <w:lang w:eastAsia="de-DE"/>
+                <w14:ligatures w14:val="standardContextual"/>
               </w:rPr>
               <w:tab/>
             </w:r>
@@ -4671,7 +4959,7 @@
                 <w:noProof/>
                 <w:webHidden/>
               </w:rPr>
-              <w:instrText xml:space="preserve"> PAGEREF _Toc72093783 \h </w:instrText>
+              <w:instrText xml:space="preserve"> PAGEREF _Toc232344698 \h </w:instrText>
             </w:r>
             <w:r>
               <w:rPr>
@@ -4712,11 +5000,14 @@
             <w:rPr>
               <w:rFonts w:eastAsiaTheme="minorEastAsia"/>
               <w:noProof/>
-              <w:sz w:val="22"/>
+              <w:kern w:val="2"/>
+              <w:sz w:val="24"/>
+              <w:szCs w:val="24"/>
               <w:lang w:eastAsia="de-DE"/>
+              <w14:ligatures w14:val="standardContextual"/>
             </w:rPr>
           </w:pPr>
-          <w:hyperlink w:anchor="_Toc72093784" w:history="1">
+          <w:hyperlink w:anchor="_Toc232344699" w:history="1">
             <w:r>
               <w:rPr>
                 <w:rStyle w:val="Hyperlink"/>
@@ -4728,8 +5019,11 @@
               <w:rPr>
                 <w:rFonts w:eastAsiaTheme="minorEastAsia"/>
                 <w:noProof/>
-                <w:sz w:val="22"/>
+                <w:kern w:val="2"/>
+                <w:sz w:val="24"/>
+                <w:szCs w:val="24"/>
                 <w:lang w:eastAsia="de-DE"/>
+                <w14:ligatures w14:val="standardContextual"/>
               </w:rPr>
               <w:tab/>
             </w:r>
@@ -4759,7 +5053,7 @@
                 <w:noProof/>
                 <w:webHidden/>
               </w:rPr>
-              <w:instrText xml:space="preserve"> PAGEREF _Toc72093784 \h </w:instrText>
+              <w:instrText xml:space="preserve"> PAGEREF _Toc232344699 \h </w:instrText>
             </w:r>
             <w:r>
               <w:rPr>
@@ -4794,17 +5088,20 @@
           <w:pPr>
             <w:pStyle w:val="Verzeichnis2"/>
             <w:tabs>
-              <w:tab w:val="left" w:pos="880"/>
+              <w:tab w:val="left" w:pos="720"/>
               <w:tab w:val="right" w:leader="dot" w:pos="9911"/>
             </w:tabs>
             <w:rPr>
               <w:rFonts w:eastAsiaTheme="minorEastAsia"/>
               <w:noProof/>
-              <w:sz w:val="22"/>
+              <w:kern w:val="2"/>
+              <w:sz w:val="24"/>
+              <w:szCs w:val="24"/>
               <w:lang w:eastAsia="de-DE"/>
+              <w14:ligatures w14:val="standardContextual"/>
             </w:rPr>
           </w:pPr>
-          <w:hyperlink w:anchor="_Toc72093785" w:history="1">
+          <w:hyperlink w:anchor="_Toc232344700" w:history="1">
             <w:r>
               <w:rPr>
                 <w:rStyle w:val="Hyperlink"/>
@@ -4816,8 +5113,11 @@
               <w:rPr>
                 <w:rFonts w:eastAsiaTheme="minorEastAsia"/>
                 <w:noProof/>
-                <w:sz w:val="22"/>
+                <w:kern w:val="2"/>
+                <w:sz w:val="24"/>
+                <w:szCs w:val="24"/>
                 <w:lang w:eastAsia="de-DE"/>
+                <w14:ligatures w14:val="standardContextual"/>
               </w:rPr>
               <w:tab/>
             </w:r>
@@ -4847,7 +5147,7 @@
                 <w:noProof/>
                 <w:webHidden/>
               </w:rPr>
-              <w:instrText xml:space="preserve"> PAGEREF _Toc72093785 \h </w:instrText>
+              <w:instrText xml:space="preserve"> PAGEREF _Toc232344700 \h </w:instrText>
             </w:r>
             <w:r>
               <w:rPr>
@@ -4882,17 +5182,20 @@
           <w:pPr>
             <w:pStyle w:val="Verzeichnis3"/>
             <w:tabs>
-              <w:tab w:val="left" w:pos="1100"/>
+              <w:tab w:val="left" w:pos="1200"/>
               <w:tab w:val="right" w:leader="dot" w:pos="9911"/>
             </w:tabs>
             <w:rPr>
               <w:rFonts w:eastAsiaTheme="minorEastAsia"/>
               <w:noProof/>
-              <w:sz w:val="22"/>
+              <w:kern w:val="2"/>
+              <w:sz w:val="24"/>
+              <w:szCs w:val="24"/>
               <w:lang w:eastAsia="de-DE"/>
+              <w14:ligatures w14:val="standardContextual"/>
             </w:rPr>
           </w:pPr>
-          <w:hyperlink w:anchor="_Toc72093786" w:history="1">
+          <w:hyperlink w:anchor="_Toc232344701" w:history="1">
             <w:r>
               <w:rPr>
                 <w:rStyle w:val="Hyperlink"/>
@@ -4904,8 +5207,11 @@
               <w:rPr>
                 <w:rFonts w:eastAsiaTheme="minorEastAsia"/>
                 <w:noProof/>
-                <w:sz w:val="22"/>
+                <w:kern w:val="2"/>
+                <w:sz w:val="24"/>
+                <w:szCs w:val="24"/>
                 <w:lang w:eastAsia="de-DE"/>
+                <w14:ligatures w14:val="standardContextual"/>
               </w:rPr>
               <w:tab/>
             </w:r>
@@ -4935,7 +5241,7 @@
                 <w:noProof/>
                 <w:webHidden/>
               </w:rPr>
-              <w:instrText xml:space="preserve"> PAGEREF _Toc72093786 \h </w:instrText>
+              <w:instrText xml:space="preserve"> PAGEREF _Toc232344701 \h </w:instrText>
             </w:r>
             <w:r>
               <w:rPr>
@@ -4970,17 +5276,20 @@
           <w:pPr>
             <w:pStyle w:val="Verzeichnis3"/>
             <w:tabs>
-              <w:tab w:val="left" w:pos="1100"/>
+              <w:tab w:val="left" w:pos="1200"/>
               <w:tab w:val="right" w:leader="dot" w:pos="9911"/>
             </w:tabs>
             <w:rPr>
               <w:rFonts w:eastAsiaTheme="minorEastAsia"/>
               <w:noProof/>
-              <w:sz w:val="22"/>
+              <w:kern w:val="2"/>
+              <w:sz w:val="24"/>
+              <w:szCs w:val="24"/>
               <w:lang w:eastAsia="de-DE"/>
+              <w14:ligatures w14:val="standardContextual"/>
             </w:rPr>
           </w:pPr>
-          <w:hyperlink w:anchor="_Toc72093787" w:history="1">
+          <w:hyperlink w:anchor="_Toc232344702" w:history="1">
             <w:r>
               <w:rPr>
                 <w:rStyle w:val="Hyperlink"/>
@@ -4992,8 +5301,11 @@
               <w:rPr>
                 <w:rFonts w:eastAsiaTheme="minorEastAsia"/>
                 <w:noProof/>
-                <w:sz w:val="22"/>
+                <w:kern w:val="2"/>
+                <w:sz w:val="24"/>
+                <w:szCs w:val="24"/>
                 <w:lang w:eastAsia="de-DE"/>
+                <w14:ligatures w14:val="standardContextual"/>
               </w:rPr>
               <w:tab/>
             </w:r>
@@ -5023,7 +5335,7 @@
                 <w:noProof/>
                 <w:webHidden/>
               </w:rPr>
-              <w:instrText xml:space="preserve"> PAGEREF _Toc72093787 \h </w:instrText>
+              <w:instrText xml:space="preserve"> PAGEREF _Toc232344702 \h </w:instrText>
             </w:r>
             <w:r>
               <w:rPr>
@@ -5058,17 +5370,20 @@
           <w:pPr>
             <w:pStyle w:val="Verzeichnis3"/>
             <w:tabs>
-              <w:tab w:val="left" w:pos="1100"/>
+              <w:tab w:val="left" w:pos="1200"/>
               <w:tab w:val="right" w:leader="dot" w:pos="9911"/>
             </w:tabs>
             <w:rPr>
               <w:rFonts w:eastAsiaTheme="minorEastAsia"/>
               <w:noProof/>
-              <w:sz w:val="22"/>
+              <w:kern w:val="2"/>
+              <w:sz w:val="24"/>
+              <w:szCs w:val="24"/>
               <w:lang w:eastAsia="de-DE"/>
+              <w14:ligatures w14:val="standardContextual"/>
             </w:rPr>
           </w:pPr>
-          <w:hyperlink w:anchor="_Toc72093788" w:history="1">
+          <w:hyperlink w:anchor="_Toc232344703" w:history="1">
             <w:r>
               <w:rPr>
                 <w:rStyle w:val="Hyperlink"/>
@@ -5080,8 +5395,11 @@
               <w:rPr>
                 <w:rFonts w:eastAsiaTheme="minorEastAsia"/>
                 <w:noProof/>
-                <w:sz w:val="22"/>
+                <w:kern w:val="2"/>
+                <w:sz w:val="24"/>
+                <w:szCs w:val="24"/>
                 <w:lang w:eastAsia="de-DE"/>
+                <w14:ligatures w14:val="standardContextual"/>
               </w:rPr>
               <w:tab/>
             </w:r>
@@ -5111,7 +5429,7 @@
                 <w:noProof/>
                 <w:webHidden/>
               </w:rPr>
-              <w:instrText xml:space="preserve"> PAGEREF _Toc72093788 \h </w:instrText>
+              <w:instrText xml:space="preserve"> PAGEREF _Toc232344703 \h </w:instrText>
             </w:r>
             <w:r>
               <w:rPr>
@@ -5146,17 +5464,20 @@
           <w:pPr>
             <w:pStyle w:val="Verzeichnis3"/>
             <w:tabs>
-              <w:tab w:val="left" w:pos="1100"/>
+              <w:tab w:val="left" w:pos="1200"/>
               <w:tab w:val="right" w:leader="dot" w:pos="9911"/>
             </w:tabs>
             <w:rPr>
               <w:rFonts w:eastAsiaTheme="minorEastAsia"/>
               <w:noProof/>
-              <w:sz w:val="22"/>
+              <w:kern w:val="2"/>
+              <w:sz w:val="24"/>
+              <w:szCs w:val="24"/>
               <w:lang w:eastAsia="de-DE"/>
+              <w14:ligatures w14:val="standardContextual"/>
             </w:rPr>
           </w:pPr>
-          <w:hyperlink w:anchor="_Toc72093789" w:history="1">
+          <w:hyperlink w:anchor="_Toc232344704" w:history="1">
             <w:r>
               <w:rPr>
                 <w:rStyle w:val="Hyperlink"/>
@@ -5168,8 +5489,11 @@
               <w:rPr>
                 <w:rFonts w:eastAsiaTheme="minorEastAsia"/>
                 <w:noProof/>
-                <w:sz w:val="22"/>
+                <w:kern w:val="2"/>
+                <w:sz w:val="24"/>
+                <w:szCs w:val="24"/>
                 <w:lang w:eastAsia="de-DE"/>
+                <w14:ligatures w14:val="standardContextual"/>
               </w:rPr>
               <w:tab/>
             </w:r>
@@ -5199,7 +5523,7 @@
                 <w:noProof/>
                 <w:webHidden/>
               </w:rPr>
-              <w:instrText xml:space="preserve"> PAGEREF _Toc72093789 \h </w:instrText>
+              <w:instrText xml:space="preserve"> PAGEREF _Toc232344704 \h </w:instrText>
             </w:r>
             <w:r>
               <w:rPr>
@@ -5234,17 +5558,20 @@
           <w:pPr>
             <w:pStyle w:val="Verzeichnis3"/>
             <w:tabs>
-              <w:tab w:val="left" w:pos="1100"/>
+              <w:tab w:val="left" w:pos="1200"/>
               <w:tab w:val="right" w:leader="dot" w:pos="9911"/>
             </w:tabs>
             <w:rPr>
               <w:rFonts w:eastAsiaTheme="minorEastAsia"/>
               <w:noProof/>
-              <w:sz w:val="22"/>
+              <w:kern w:val="2"/>
+              <w:sz w:val="24"/>
+              <w:szCs w:val="24"/>
               <w:lang w:eastAsia="de-DE"/>
+              <w14:ligatures w14:val="standardContextual"/>
             </w:rPr>
           </w:pPr>
-          <w:hyperlink w:anchor="_Toc72093790" w:history="1">
+          <w:hyperlink w:anchor="_Toc232344705" w:history="1">
             <w:r>
               <w:rPr>
                 <w:rStyle w:val="Hyperlink"/>
@@ -5256,8 +5583,11 @@
               <w:rPr>
                 <w:rFonts w:eastAsiaTheme="minorEastAsia"/>
                 <w:noProof/>
-                <w:sz w:val="22"/>
+                <w:kern w:val="2"/>
+                <w:sz w:val="24"/>
+                <w:szCs w:val="24"/>
                 <w:lang w:eastAsia="de-DE"/>
+                <w14:ligatures w14:val="standardContextual"/>
               </w:rPr>
               <w:tab/>
             </w:r>
@@ -5287,7 +5617,7 @@
                 <w:noProof/>
                 <w:webHidden/>
               </w:rPr>
-              <w:instrText xml:space="preserve"> PAGEREF _Toc72093790 \h </w:instrText>
+              <w:instrText xml:space="preserve"> PAGEREF _Toc232344705 \h </w:instrText>
             </w:r>
             <w:r>
               <w:rPr>
@@ -5322,17 +5652,20 @@
           <w:pPr>
             <w:pStyle w:val="Verzeichnis2"/>
             <w:tabs>
-              <w:tab w:val="left" w:pos="880"/>
+              <w:tab w:val="left" w:pos="720"/>
               <w:tab w:val="right" w:leader="dot" w:pos="9911"/>
             </w:tabs>
             <w:rPr>
               <w:rFonts w:eastAsiaTheme="minorEastAsia"/>
               <w:noProof/>
-              <w:sz w:val="22"/>
+              <w:kern w:val="2"/>
+              <w:sz w:val="24"/>
+              <w:szCs w:val="24"/>
               <w:lang w:eastAsia="de-DE"/>
+              <w14:ligatures w14:val="standardContextual"/>
             </w:rPr>
           </w:pPr>
-          <w:hyperlink w:anchor="_Toc72093791" w:history="1">
+          <w:hyperlink w:anchor="_Toc232344706" w:history="1">
             <w:r>
               <w:rPr>
                 <w:rStyle w:val="Hyperlink"/>
@@ -5344,8 +5677,11 @@
               <w:rPr>
                 <w:rFonts w:eastAsiaTheme="minorEastAsia"/>
                 <w:noProof/>
-                <w:sz w:val="22"/>
+                <w:kern w:val="2"/>
+                <w:sz w:val="24"/>
+                <w:szCs w:val="24"/>
                 <w:lang w:eastAsia="de-DE"/>
+                <w14:ligatures w14:val="standardContextual"/>
               </w:rPr>
               <w:tab/>
             </w:r>
@@ -5375,7 +5711,7 @@
                 <w:noProof/>
                 <w:webHidden/>
               </w:rPr>
-              <w:instrText xml:space="preserve"> PAGEREF _Toc72093791 \h </w:instrText>
+              <w:instrText xml:space="preserve"> PAGEREF _Toc232344706 \h </w:instrText>
             </w:r>
             <w:r>
               <w:rPr>
@@ -5410,17 +5746,20 @@
           <w:pPr>
             <w:pStyle w:val="Verzeichnis2"/>
             <w:tabs>
-              <w:tab w:val="left" w:pos="880"/>
+              <w:tab w:val="left" w:pos="720"/>
               <w:tab w:val="right" w:leader="dot" w:pos="9911"/>
             </w:tabs>
             <w:rPr>
               <w:rFonts w:eastAsiaTheme="minorEastAsia"/>
               <w:noProof/>
-              <w:sz w:val="22"/>
+              <w:kern w:val="2"/>
+              <w:sz w:val="24"/>
+              <w:szCs w:val="24"/>
               <w:lang w:eastAsia="de-DE"/>
+              <w14:ligatures w14:val="standardContextual"/>
             </w:rPr>
           </w:pPr>
-          <w:hyperlink w:anchor="_Toc72093792" w:history="1">
+          <w:hyperlink w:anchor="_Toc232344707" w:history="1">
             <w:r>
               <w:rPr>
                 <w:rStyle w:val="Hyperlink"/>
@@ -5432,8 +5771,11 @@
               <w:rPr>
                 <w:rFonts w:eastAsiaTheme="minorEastAsia"/>
                 <w:noProof/>
-                <w:sz w:val="22"/>
+                <w:kern w:val="2"/>
+                <w:sz w:val="24"/>
+                <w:szCs w:val="24"/>
                 <w:lang w:eastAsia="de-DE"/>
+                <w14:ligatures w14:val="standardContextual"/>
               </w:rPr>
               <w:tab/>
             </w:r>
@@ -5463,7 +5805,7 @@
                 <w:noProof/>
                 <w:webHidden/>
               </w:rPr>
-              <w:instrText xml:space="preserve"> PAGEREF _Toc72093792 \h </w:instrText>
+              <w:instrText xml:space="preserve"> PAGEREF _Toc232344707 \h </w:instrText>
             </w:r>
             <w:r>
               <w:rPr>
@@ -5504,11 +5846,14 @@
             <w:rPr>
               <w:rFonts w:eastAsiaTheme="minorEastAsia"/>
               <w:noProof/>
-              <w:sz w:val="22"/>
+              <w:kern w:val="2"/>
+              <w:sz w:val="24"/>
+              <w:szCs w:val="24"/>
               <w:lang w:eastAsia="de-DE"/>
+              <w14:ligatures w14:val="standardContextual"/>
             </w:rPr>
           </w:pPr>
-          <w:hyperlink w:anchor="_Toc72093793" w:history="1">
+          <w:hyperlink w:anchor="_Toc232344708" w:history="1">
             <w:r>
               <w:rPr>
                 <w:rStyle w:val="Hyperlink"/>
@@ -5520,8 +5865,11 @@
               <w:rPr>
                 <w:rFonts w:eastAsiaTheme="minorEastAsia"/>
                 <w:noProof/>
-                <w:sz w:val="22"/>
+                <w:kern w:val="2"/>
+                <w:sz w:val="24"/>
+                <w:szCs w:val="24"/>
                 <w:lang w:eastAsia="de-DE"/>
+                <w14:ligatures w14:val="standardContextual"/>
               </w:rPr>
               <w:tab/>
             </w:r>
@@ -5551,7 +5899,7 @@
                 <w:noProof/>
                 <w:webHidden/>
               </w:rPr>
-              <w:instrText xml:space="preserve"> PAGEREF _Toc72093793 \h </w:instrText>
+              <w:instrText xml:space="preserve"> PAGEREF _Toc232344708 \h </w:instrText>
             </w:r>
             <w:r>
               <w:rPr>
@@ -5586,17 +5934,20 @@
           <w:pPr>
             <w:pStyle w:val="Verzeichnis2"/>
             <w:tabs>
-              <w:tab w:val="left" w:pos="880"/>
+              <w:tab w:val="left" w:pos="720"/>
               <w:tab w:val="right" w:leader="dot" w:pos="9911"/>
             </w:tabs>
             <w:rPr>
               <w:rFonts w:eastAsiaTheme="minorEastAsia"/>
               <w:noProof/>
-              <w:sz w:val="22"/>
+              <w:kern w:val="2"/>
+              <w:sz w:val="24"/>
+              <w:szCs w:val="24"/>
               <w:lang w:eastAsia="de-DE"/>
+              <w14:ligatures w14:val="standardContextual"/>
             </w:rPr>
           </w:pPr>
-          <w:hyperlink w:anchor="_Toc72093794" w:history="1">
+          <w:hyperlink w:anchor="_Toc232344709" w:history="1">
             <w:r>
               <w:rPr>
                 <w:rStyle w:val="Hyperlink"/>
@@ -5608,8 +5959,11 @@
               <w:rPr>
                 <w:rFonts w:eastAsiaTheme="minorEastAsia"/>
                 <w:noProof/>
-                <w:sz w:val="22"/>
+                <w:kern w:val="2"/>
+                <w:sz w:val="24"/>
+                <w:szCs w:val="24"/>
                 <w:lang w:eastAsia="de-DE"/>
+                <w14:ligatures w14:val="standardContextual"/>
               </w:rPr>
               <w:tab/>
             </w:r>
@@ -5639,7 +5993,7 @@
                 <w:noProof/>
                 <w:webHidden/>
               </w:rPr>
-              <w:instrText xml:space="preserve"> PAGEREF _Toc72093794 \h </w:instrText>
+              <w:instrText xml:space="preserve"> PAGEREF _Toc232344709 \h </w:instrText>
             </w:r>
             <w:r>
               <w:rPr>
@@ -5674,17 +6028,20 @@
           <w:pPr>
             <w:pStyle w:val="Verzeichnis3"/>
             <w:tabs>
-              <w:tab w:val="left" w:pos="1100"/>
+              <w:tab w:val="left" w:pos="1200"/>
               <w:tab w:val="right" w:leader="dot" w:pos="9911"/>
             </w:tabs>
             <w:rPr>
               <w:rFonts w:eastAsiaTheme="minorEastAsia"/>
               <w:noProof/>
-              <w:sz w:val="22"/>
+              <w:kern w:val="2"/>
+              <w:sz w:val="24"/>
+              <w:szCs w:val="24"/>
               <w:lang w:eastAsia="de-DE"/>
+              <w14:ligatures w14:val="standardContextual"/>
             </w:rPr>
           </w:pPr>
-          <w:hyperlink w:anchor="_Toc72093795" w:history="1">
+          <w:hyperlink w:anchor="_Toc232344710" w:history="1">
             <w:r>
               <w:rPr>
                 <w:rStyle w:val="Hyperlink"/>
@@ -5696,8 +6053,11 @@
               <w:rPr>
                 <w:rFonts w:eastAsiaTheme="minorEastAsia"/>
                 <w:noProof/>
-                <w:sz w:val="22"/>
+                <w:kern w:val="2"/>
+                <w:sz w:val="24"/>
+                <w:szCs w:val="24"/>
                 <w:lang w:eastAsia="de-DE"/>
+                <w14:ligatures w14:val="standardContextual"/>
               </w:rPr>
               <w:tab/>
             </w:r>
@@ -5727,7 +6087,7 @@
                 <w:noProof/>
                 <w:webHidden/>
               </w:rPr>
-              <w:instrText xml:space="preserve"> PAGEREF _Toc72093795 \h </w:instrText>
+              <w:instrText xml:space="preserve"> PAGEREF _Toc232344710 \h </w:instrText>
             </w:r>
             <w:r>
               <w:rPr>
@@ -5762,17 +6122,20 @@
           <w:pPr>
             <w:pStyle w:val="Verzeichnis3"/>
             <w:tabs>
-              <w:tab w:val="left" w:pos="1100"/>
+              <w:tab w:val="left" w:pos="1200"/>
               <w:tab w:val="right" w:leader="dot" w:pos="9911"/>
             </w:tabs>
             <w:rPr>
               <w:rFonts w:eastAsiaTheme="minorEastAsia"/>
               <w:noProof/>
-              <w:sz w:val="22"/>
+              <w:kern w:val="2"/>
+              <w:sz w:val="24"/>
+              <w:szCs w:val="24"/>
               <w:lang w:eastAsia="de-DE"/>
+              <w14:ligatures w14:val="standardContextual"/>
             </w:rPr>
           </w:pPr>
-          <w:hyperlink w:anchor="_Toc72093796" w:history="1">
+          <w:hyperlink w:anchor="_Toc232344711" w:history="1">
             <w:r>
               <w:rPr>
                 <w:rStyle w:val="Hyperlink"/>
@@ -5784,8 +6147,11 @@
               <w:rPr>
                 <w:rFonts w:eastAsiaTheme="minorEastAsia"/>
                 <w:noProof/>
-                <w:sz w:val="22"/>
+                <w:kern w:val="2"/>
+                <w:sz w:val="24"/>
+                <w:szCs w:val="24"/>
                 <w:lang w:eastAsia="de-DE"/>
+                <w14:ligatures w14:val="standardContextual"/>
               </w:rPr>
               <w:tab/>
             </w:r>
@@ -5815,7 +6181,7 @@
                 <w:noProof/>
                 <w:webHidden/>
               </w:rPr>
-              <w:instrText xml:space="preserve"> PAGEREF _Toc72093796 \h </w:instrText>
+              <w:instrText xml:space="preserve"> PAGEREF _Toc232344711 \h </w:instrText>
             </w:r>
             <w:r>
               <w:rPr>
@@ -5850,17 +6216,20 @@
           <w:pPr>
             <w:pStyle w:val="Verzeichnis3"/>
             <w:tabs>
-              <w:tab w:val="left" w:pos="1100"/>
+              <w:tab w:val="left" w:pos="1200"/>
               <w:tab w:val="right" w:leader="dot" w:pos="9911"/>
             </w:tabs>
             <w:rPr>
               <w:rFonts w:eastAsiaTheme="minorEastAsia"/>
               <w:noProof/>
-              <w:sz w:val="22"/>
+              <w:kern w:val="2"/>
+              <w:sz w:val="24"/>
+              <w:szCs w:val="24"/>
               <w:lang w:eastAsia="de-DE"/>
+              <w14:ligatures w14:val="standardContextual"/>
             </w:rPr>
           </w:pPr>
-          <w:hyperlink w:anchor="_Toc72093797" w:history="1">
+          <w:hyperlink w:anchor="_Toc232344712" w:history="1">
             <w:r>
               <w:rPr>
                 <w:rStyle w:val="Hyperlink"/>
@@ -5872,8 +6241,11 @@
               <w:rPr>
                 <w:rFonts w:eastAsiaTheme="minorEastAsia"/>
                 <w:noProof/>
-                <w:sz w:val="22"/>
+                <w:kern w:val="2"/>
+                <w:sz w:val="24"/>
+                <w:szCs w:val="24"/>
                 <w:lang w:eastAsia="de-DE"/>
+                <w14:ligatures w14:val="standardContextual"/>
               </w:rPr>
               <w:tab/>
             </w:r>
@@ -5903,7 +6275,7 @@
                 <w:noProof/>
                 <w:webHidden/>
               </w:rPr>
-              <w:instrText xml:space="preserve"> PAGEREF _Toc72093797 \h </w:instrText>
+              <w:instrText xml:space="preserve"> PAGEREF _Toc232344712 \h </w:instrText>
             </w:r>
             <w:r>
               <w:rPr>
@@ -5938,17 +6310,20 @@
           <w:pPr>
             <w:pStyle w:val="Verzeichnis3"/>
             <w:tabs>
-              <w:tab w:val="left" w:pos="1100"/>
+              <w:tab w:val="left" w:pos="1200"/>
               <w:tab w:val="right" w:leader="dot" w:pos="9911"/>
             </w:tabs>
             <w:rPr>
               <w:rFonts w:eastAsiaTheme="minorEastAsia"/>
               <w:noProof/>
-              <w:sz w:val="22"/>
+              <w:kern w:val="2"/>
+              <w:sz w:val="24"/>
+              <w:szCs w:val="24"/>
               <w:lang w:eastAsia="de-DE"/>
+              <w14:ligatures w14:val="standardContextual"/>
             </w:rPr>
           </w:pPr>
-          <w:hyperlink w:anchor="_Toc72093798" w:history="1">
+          <w:hyperlink w:anchor="_Toc232344713" w:history="1">
             <w:r>
               <w:rPr>
                 <w:rStyle w:val="Hyperlink"/>
@@ -5960,8 +6335,11 @@
               <w:rPr>
                 <w:rFonts w:eastAsiaTheme="minorEastAsia"/>
                 <w:noProof/>
-                <w:sz w:val="22"/>
+                <w:kern w:val="2"/>
+                <w:sz w:val="24"/>
+                <w:szCs w:val="24"/>
                 <w:lang w:eastAsia="de-DE"/>
+                <w14:ligatures w14:val="standardContextual"/>
               </w:rPr>
               <w:tab/>
             </w:r>
@@ -5991,7 +6369,7 @@
                 <w:noProof/>
                 <w:webHidden/>
               </w:rPr>
-              <w:instrText xml:space="preserve"> PAGEREF _Toc72093798 \h </w:instrText>
+              <w:instrText xml:space="preserve"> PAGEREF _Toc232344713 \h </w:instrText>
             </w:r>
             <w:r>
               <w:rPr>
@@ -6026,17 +6404,20 @@
           <w:pPr>
             <w:pStyle w:val="Verzeichnis2"/>
             <w:tabs>
-              <w:tab w:val="left" w:pos="880"/>
+              <w:tab w:val="left" w:pos="720"/>
               <w:tab w:val="right" w:leader="dot" w:pos="9911"/>
             </w:tabs>
             <w:rPr>
               <w:rFonts w:eastAsiaTheme="minorEastAsia"/>
               <w:noProof/>
-              <w:sz w:val="22"/>
+              <w:kern w:val="2"/>
+              <w:sz w:val="24"/>
+              <w:szCs w:val="24"/>
               <w:lang w:eastAsia="de-DE"/>
+              <w14:ligatures w14:val="standardContextual"/>
             </w:rPr>
           </w:pPr>
-          <w:hyperlink w:anchor="_Toc72093799" w:history="1">
+          <w:hyperlink w:anchor="_Toc232344714" w:history="1">
             <w:r>
               <w:rPr>
                 <w:rStyle w:val="Hyperlink"/>
@@ -6048,8 +6429,11 @@
               <w:rPr>
                 <w:rFonts w:eastAsiaTheme="minorEastAsia"/>
                 <w:noProof/>
-                <w:sz w:val="22"/>
+                <w:kern w:val="2"/>
+                <w:sz w:val="24"/>
+                <w:szCs w:val="24"/>
                 <w:lang w:eastAsia="de-DE"/>
+                <w14:ligatures w14:val="standardContextual"/>
               </w:rPr>
               <w:tab/>
             </w:r>
@@ -6079,7 +6463,7 @@
                 <w:noProof/>
                 <w:webHidden/>
               </w:rPr>
-              <w:instrText xml:space="preserve"> PAGEREF _Toc72093799 \h </w:instrText>
+              <w:instrText xml:space="preserve"> PAGEREF _Toc232344714 \h </w:instrText>
             </w:r>
             <w:r>
               <w:rPr>
@@ -6114,17 +6498,20 @@
           <w:pPr>
             <w:pStyle w:val="Verzeichnis3"/>
             <w:tabs>
-              <w:tab w:val="left" w:pos="1100"/>
+              <w:tab w:val="left" w:pos="1200"/>
               <w:tab w:val="right" w:leader="dot" w:pos="9911"/>
             </w:tabs>
             <w:rPr>
               <w:rFonts w:eastAsiaTheme="minorEastAsia"/>
               <w:noProof/>
-              <w:sz w:val="22"/>
+              <w:kern w:val="2"/>
+              <w:sz w:val="24"/>
+              <w:szCs w:val="24"/>
               <w:lang w:eastAsia="de-DE"/>
+              <w14:ligatures w14:val="standardContextual"/>
             </w:rPr>
           </w:pPr>
-          <w:hyperlink w:anchor="_Toc72093800" w:history="1">
+          <w:hyperlink w:anchor="_Toc232344715" w:history="1">
             <w:r>
               <w:rPr>
                 <w:rStyle w:val="Hyperlink"/>
@@ -6136,8 +6523,11 @@
               <w:rPr>
                 <w:rFonts w:eastAsiaTheme="minorEastAsia"/>
                 <w:noProof/>
-                <w:sz w:val="22"/>
+                <w:kern w:val="2"/>
+                <w:sz w:val="24"/>
+                <w:szCs w:val="24"/>
                 <w:lang w:eastAsia="de-DE"/>
+                <w14:ligatures w14:val="standardContextual"/>
               </w:rPr>
               <w:tab/>
             </w:r>
@@ -6167,7 +6557,7 @@
                 <w:noProof/>
                 <w:webHidden/>
               </w:rPr>
-              <w:instrText xml:space="preserve"> PAGEREF _Toc72093800 \h </w:instrText>
+              <w:instrText xml:space="preserve"> PAGEREF _Toc232344715 \h </w:instrText>
             </w:r>
             <w:r>
               <w:rPr>
@@ -6202,17 +6592,20 @@
           <w:pPr>
             <w:pStyle w:val="Verzeichnis3"/>
             <w:tabs>
-              <w:tab w:val="left" w:pos="1100"/>
+              <w:tab w:val="left" w:pos="1200"/>
               <w:tab w:val="right" w:leader="dot" w:pos="9911"/>
             </w:tabs>
             <w:rPr>
               <w:rFonts w:eastAsiaTheme="minorEastAsia"/>
               <w:noProof/>
-              <w:sz w:val="22"/>
+              <w:kern w:val="2"/>
+              <w:sz w:val="24"/>
+              <w:szCs w:val="24"/>
               <w:lang w:eastAsia="de-DE"/>
+              <w14:ligatures w14:val="standardContextual"/>
             </w:rPr>
           </w:pPr>
-          <w:hyperlink w:anchor="_Toc72093801" w:history="1">
+          <w:hyperlink w:anchor="_Toc232344716" w:history="1">
             <w:r>
               <w:rPr>
                 <w:rStyle w:val="Hyperlink"/>
@@ -6224,8 +6617,11 @@
               <w:rPr>
                 <w:rFonts w:eastAsiaTheme="minorEastAsia"/>
                 <w:noProof/>
-                <w:sz w:val="22"/>
+                <w:kern w:val="2"/>
+                <w:sz w:val="24"/>
+                <w:szCs w:val="24"/>
                 <w:lang w:eastAsia="de-DE"/>
+                <w14:ligatures w14:val="standardContextual"/>
               </w:rPr>
               <w:tab/>
             </w:r>
@@ -6255,7 +6651,7 @@
                 <w:noProof/>
                 <w:webHidden/>
               </w:rPr>
-              <w:instrText xml:space="preserve"> PAGEREF _Toc72093801 \h </w:instrText>
+              <w:instrText xml:space="preserve"> PAGEREF _Toc232344716 \h </w:instrText>
             </w:r>
             <w:r>
               <w:rPr>
@@ -6290,17 +6686,20 @@
           <w:pPr>
             <w:pStyle w:val="Verzeichnis3"/>
             <w:tabs>
-              <w:tab w:val="left" w:pos="1100"/>
+              <w:tab w:val="left" w:pos="1200"/>
               <w:tab w:val="right" w:leader="dot" w:pos="9911"/>
             </w:tabs>
             <w:rPr>
               <w:rFonts w:eastAsiaTheme="minorEastAsia"/>
               <w:noProof/>
-              <w:sz w:val="22"/>
+              <w:kern w:val="2"/>
+              <w:sz w:val="24"/>
+              <w:szCs w:val="24"/>
               <w:lang w:eastAsia="de-DE"/>
+              <w14:ligatures w14:val="standardContextual"/>
             </w:rPr>
           </w:pPr>
-          <w:hyperlink w:anchor="_Toc72093802" w:history="1">
+          <w:hyperlink w:anchor="_Toc232344717" w:history="1">
             <w:r>
               <w:rPr>
                 <w:rStyle w:val="Hyperlink"/>
@@ -6312,8 +6711,11 @@
               <w:rPr>
                 <w:rFonts w:eastAsiaTheme="minorEastAsia"/>
                 <w:noProof/>
-                <w:sz w:val="22"/>
+                <w:kern w:val="2"/>
+                <w:sz w:val="24"/>
+                <w:szCs w:val="24"/>
                 <w:lang w:eastAsia="de-DE"/>
+                <w14:ligatures w14:val="standardContextual"/>
               </w:rPr>
               <w:tab/>
             </w:r>
@@ -6343,7 +6745,7 @@
                 <w:noProof/>
                 <w:webHidden/>
               </w:rPr>
-              <w:instrText xml:space="preserve"> PAGEREF _Toc72093802 \h </w:instrText>
+              <w:instrText xml:space="preserve"> PAGEREF _Toc232344717 \h </w:instrText>
             </w:r>
             <w:r>
               <w:rPr>
@@ -6378,17 +6780,20 @@
           <w:pPr>
             <w:pStyle w:val="Verzeichnis2"/>
             <w:tabs>
-              <w:tab w:val="left" w:pos="880"/>
+              <w:tab w:val="left" w:pos="720"/>
               <w:tab w:val="right" w:leader="dot" w:pos="9911"/>
             </w:tabs>
             <w:rPr>
               <w:rFonts w:eastAsiaTheme="minorEastAsia"/>
               <w:noProof/>
-              <w:sz w:val="22"/>
+              <w:kern w:val="2"/>
+              <w:sz w:val="24"/>
+              <w:szCs w:val="24"/>
               <w:lang w:eastAsia="de-DE"/>
+              <w14:ligatures w14:val="standardContextual"/>
             </w:rPr>
           </w:pPr>
-          <w:hyperlink w:anchor="_Toc72093803" w:history="1">
+          <w:hyperlink w:anchor="_Toc232344718" w:history="1">
             <w:r>
               <w:rPr>
                 <w:rStyle w:val="Hyperlink"/>
@@ -6400,8 +6805,11 @@
               <w:rPr>
                 <w:rFonts w:eastAsiaTheme="minorEastAsia"/>
                 <w:noProof/>
-                <w:sz w:val="22"/>
+                <w:kern w:val="2"/>
+                <w:sz w:val="24"/>
+                <w:szCs w:val="24"/>
                 <w:lang w:eastAsia="de-DE"/>
+                <w14:ligatures w14:val="standardContextual"/>
               </w:rPr>
               <w:tab/>
             </w:r>
@@ -6431,7 +6839,7 @@
                 <w:noProof/>
                 <w:webHidden/>
               </w:rPr>
-              <w:instrText xml:space="preserve"> PAGEREF _Toc72093803 \h </w:instrText>
+              <w:instrText xml:space="preserve"> PAGEREF _Toc232344718 \h </w:instrText>
             </w:r>
             <w:r>
               <w:rPr>
@@ -6490,7 +6898,7 @@
       <w:pPr>
         <w:pStyle w:val="berschrift1"/>
       </w:pPr>
-      <w:bookmarkStart w:id="0" w:name="_Toc72093736"/>
+      <w:bookmarkStart w:id="0" w:name="_Toc232344651"/>
       <w:r>
         <w:t>Einordnung des IT-Notfallplans</w:t>
       </w:r>
@@ -6523,7 +6931,7 @@
                     <pic:cNvPicPr/>
                   </pic:nvPicPr>
                   <pic:blipFill>
-                    <a:blip r:embed="rId9"/>
+                    <a:blip r:embed="rId8"/>
                     <a:stretch>
                       <a:fillRect/>
                     </a:stretch>
@@ -6666,7 +7074,7 @@
       <w:pPr>
         <w:pStyle w:val="berschrift1"/>
       </w:pPr>
-      <w:bookmarkStart w:id="1" w:name="_Toc72093737"/>
+      <w:bookmarkStart w:id="1" w:name="_Toc232344652"/>
       <w:r>
         <w:t>Erkennen und Melden potenzielle</w:t>
       </w:r>
@@ -6885,7 +7293,7 @@
       <w:pPr>
         <w:pStyle w:val="berschrift2"/>
       </w:pPr>
-      <w:bookmarkStart w:id="2" w:name="_Toc72093738"/>
+      <w:bookmarkStart w:id="2" w:name="_Toc232344653"/>
       <w:r>
         <w:t xml:space="preserve">Kriterien eines potenziellen </w:t>
       </w:r>
@@ -6901,7 +7309,7 @@
       <w:pPr>
         <w:pStyle w:val="berschrift3"/>
       </w:pPr>
-      <w:bookmarkStart w:id="3" w:name="_Toc72093739"/>
+      <w:bookmarkStart w:id="3" w:name="_Toc232344654"/>
       <w:r>
         <w:t xml:space="preserve">Für den </w:t>
       </w:r>
@@ -6932,7 +7340,7 @@
       <w:pPr>
         <w:pStyle w:val="berschrift3"/>
       </w:pPr>
-      <w:bookmarkStart w:id="4" w:name="_Toc72093740"/>
+      <w:bookmarkStart w:id="4" w:name="_Toc232344655"/>
       <w:r>
         <w:t xml:space="preserve">Für den IT </w:t>
       </w:r>
@@ -6963,7 +7371,7 @@
       <w:pPr>
         <w:pStyle w:val="berschrift3"/>
       </w:pPr>
-      <w:bookmarkStart w:id="5" w:name="_Toc72093741"/>
+      <w:bookmarkStart w:id="5" w:name="_Toc232344656"/>
       <w:r>
         <w:t xml:space="preserve">Für </w:t>
       </w:r>
@@ -7052,7 +7460,7 @@
       <w:pPr>
         <w:pStyle w:val="berschrift3"/>
       </w:pPr>
-      <w:bookmarkStart w:id="6" w:name="_Toc72093742"/>
+      <w:bookmarkStart w:id="6" w:name="_Toc232344657"/>
       <w:r>
         <w:t xml:space="preserve">Für das </w:t>
       </w:r>
@@ -7089,7 +7497,7 @@
       <w:pPr>
         <w:pStyle w:val="berschrift3"/>
       </w:pPr>
-      <w:bookmarkStart w:id="7" w:name="_Toc72093743"/>
+      <w:bookmarkStart w:id="7" w:name="_Toc232344658"/>
       <w:r>
         <w:t xml:space="preserve">Für den </w:t>
       </w:r>
@@ -7130,7 +7538,7 @@
       <w:pPr>
         <w:pStyle w:val="berschrift2"/>
       </w:pPr>
-      <w:bookmarkStart w:id="8" w:name="_Toc72093744"/>
+      <w:bookmarkStart w:id="8" w:name="_Toc232344659"/>
       <w:r>
         <w:t>Automatisierte Systeme</w:t>
       </w:r>
@@ -7157,7 +7565,7 @@
       <w:pPr>
         <w:pStyle w:val="berschrift2"/>
       </w:pPr>
-      <w:bookmarkStart w:id="9" w:name="_Toc72093745"/>
+      <w:bookmarkStart w:id="9" w:name="_Toc232344660"/>
       <w:r>
         <w:t>Meld</w:t>
       </w:r>
@@ -7179,7 +7587,7 @@
       <w:pPr>
         <w:pStyle w:val="berschrift3"/>
       </w:pPr>
-      <w:bookmarkStart w:id="10" w:name="_Toc72093746"/>
+      <w:bookmarkStart w:id="10" w:name="_Toc232344661"/>
       <w:r>
         <w:t>Zu normalen Arbeitszeiten:</w:t>
       </w:r>
@@ -7273,7 +7681,7 @@
       <w:pPr>
         <w:pStyle w:val="berschrift3"/>
       </w:pPr>
-      <w:bookmarkStart w:id="11" w:name="_Toc72093747"/>
+      <w:bookmarkStart w:id="11" w:name="_Toc232344662"/>
       <w:r>
         <w:t>Außerhalb der normalen Arbeitszeiten</w:t>
       </w:r>
@@ -7314,7 +7722,7 @@
       <w:pPr>
         <w:pStyle w:val="berschrift2"/>
       </w:pPr>
-      <w:bookmarkStart w:id="12" w:name="_Toc72093748"/>
+      <w:bookmarkStart w:id="12" w:name="_Toc232344663"/>
       <w:r>
         <w:t xml:space="preserve">Diensthabende </w:t>
       </w:r>
@@ -7348,7 +7756,7 @@
       <w:pPr>
         <w:pStyle w:val="berschrift1"/>
       </w:pPr>
-      <w:bookmarkStart w:id="13" w:name="_Toc72093749"/>
+      <w:bookmarkStart w:id="13" w:name="_Toc232344664"/>
       <w:r>
         <w:t>IT-</w:t>
       </w:r>
@@ -7361,7 +7769,7 @@
       <w:pPr>
         <w:pStyle w:val="berschrift2"/>
       </w:pPr>
-      <w:bookmarkStart w:id="14" w:name="_Toc72093750"/>
+      <w:bookmarkStart w:id="14" w:name="_Toc232344665"/>
       <w:r>
         <w:t>Allgemein</w:t>
       </w:r>
@@ -7485,7 +7893,7 @@
       <w:pPr>
         <w:pStyle w:val="berschrift2"/>
       </w:pPr>
-      <w:bookmarkStart w:id="15" w:name="_Toc72093751"/>
+      <w:bookmarkStart w:id="15" w:name="_Toc232344666"/>
       <w:r>
         <w:t xml:space="preserve">Bei </w:t>
       </w:r>
@@ -7559,7 +7967,7 @@
       <w:pPr>
         <w:pStyle w:val="berschrift2"/>
       </w:pPr>
-      <w:bookmarkStart w:id="16" w:name="_Toc72093752"/>
+      <w:bookmarkStart w:id="16" w:name="_Toc232344667"/>
       <w:r>
         <w:t xml:space="preserve">Bei </w:t>
       </w:r>
@@ -7579,7 +7987,7 @@
       <w:pPr>
         <w:pStyle w:val="berschrift2"/>
       </w:pPr>
-      <w:bookmarkStart w:id="17" w:name="_Toc72093753"/>
+      <w:bookmarkStart w:id="17" w:name="_Toc232344668"/>
       <w:r>
         <w:t>Umschwenken kritischer Anwendungen auf Ersatz-Infrastruktur</w:t>
       </w:r>
@@ -7652,7 +8060,7 @@
       <w:pPr>
         <w:pStyle w:val="berschrift1"/>
       </w:pPr>
-      <w:bookmarkStart w:id="18" w:name="_Toc72093754"/>
+      <w:bookmarkStart w:id="18" w:name="_Toc232344669"/>
       <w:r>
         <w:t>Ausrufen eines IT-Notfalls</w:t>
       </w:r>
@@ -7662,7 +8070,7 @@
       <w:pPr>
         <w:pStyle w:val="berschrift3"/>
       </w:pPr>
-      <w:bookmarkStart w:id="19" w:name="_Toc72093755"/>
+      <w:bookmarkStart w:id="19" w:name="_Toc232344670"/>
       <w:r>
         <w:t>Reihenfolge</w:t>
       </w:r>
@@ -7678,7 +8086,7 @@
       <w:pPr>
         <w:pStyle w:val="berschrift3"/>
       </w:pPr>
-      <w:bookmarkStart w:id="20" w:name="_Toc72093756"/>
+      <w:bookmarkStart w:id="20" w:name="_Toc232344671"/>
       <w:r>
         <w:t>Kriterien für einen IT-Notfall</w:t>
       </w:r>
@@ -7754,7 +8162,7 @@
       <w:pPr>
         <w:pStyle w:val="berschrift3"/>
       </w:pPr>
-      <w:bookmarkStart w:id="21" w:name="_Toc72093757"/>
+      <w:bookmarkStart w:id="21" w:name="_Toc232344672"/>
       <w:r>
         <w:t>Wer ruft den Notfall aus?</w:t>
       </w:r>
@@ -7854,7 +8262,7 @@
       <w:pPr>
         <w:pStyle w:val="berschrift3"/>
       </w:pPr>
-      <w:bookmarkStart w:id="22" w:name="_Toc72093758"/>
+      <w:bookmarkStart w:id="22" w:name="_Toc232344673"/>
       <w:r>
         <w:t>Unklare Situationen, Vorwarnung</w:t>
       </w:r>
@@ -7890,7 +8298,7 @@
       <w:pPr>
         <w:pStyle w:val="berschrift2"/>
       </w:pPr>
-      <w:bookmarkStart w:id="23" w:name="_Toc72093759"/>
+      <w:bookmarkStart w:id="23" w:name="_Toc232344674"/>
       <w:r>
         <w:t>Alarmierung</w:t>
       </w:r>
@@ -7903,7 +8311,7 @@
       <w:pPr>
         <w:pStyle w:val="berschrift3"/>
       </w:pPr>
-      <w:bookmarkStart w:id="24" w:name="_Toc72093760"/>
+      <w:bookmarkStart w:id="24" w:name="_Toc232344675"/>
       <w:r>
         <w:t>Grundsätze</w:t>
       </w:r>
@@ -7976,7 +8384,7 @@
       <w:pPr>
         <w:pStyle w:val="berschrift3"/>
       </w:pPr>
-      <w:bookmarkStart w:id="25" w:name="_Toc72093761"/>
+      <w:bookmarkStart w:id="25" w:name="_Toc232344676"/>
       <w:r>
         <w:t>Alarmierung bei einem IT-Notfall</w:t>
       </w:r>
@@ -8127,7 +8535,7 @@
       <w:pPr>
         <w:pStyle w:val="berschrift3"/>
       </w:pPr>
-      <w:bookmarkStart w:id="26" w:name="_Toc72093762"/>
+      <w:bookmarkStart w:id="26" w:name="_Toc232344677"/>
       <w:r>
         <w:t>Meldebaum</w:t>
       </w:r>
@@ -8919,13 +9327,6 @@
                                   <w:szCs w:val="20"/>
                                 </w:rPr>
                                 <w:br/>
-                              </w:r>
-                              <w:r>
-                                <w:rPr>
-                                  <w:rFonts w:eastAsia="Calibri"/>
-                                  <w:color w:val="000000"/>
-                                  <w:szCs w:val="20"/>
-                                </w:rPr>
                                 <w:t>ArbVorber</w:t>
                               </w:r>
                             </w:p>
@@ -10402,7 +10803,7 @@
       <w:pPr>
         <w:pStyle w:val="berschrift3"/>
       </w:pPr>
-      <w:bookmarkStart w:id="27" w:name="_Toc72093763"/>
+      <w:bookmarkStart w:id="27" w:name="_Toc232344678"/>
       <w:r>
         <w:t>Standardisierte Meldung</w:t>
       </w:r>
@@ -10507,7 +10908,7 @@
       <w:pPr>
         <w:pStyle w:val="berschrift1"/>
       </w:pPr>
-      <w:bookmarkStart w:id="28" w:name="_Toc72093764"/>
+      <w:bookmarkStart w:id="28" w:name="_Toc232344679"/>
       <w:r>
         <w:t>Notfall</w:t>
       </w:r>
@@ -10529,7 +10930,7 @@
       <w:pPr>
         <w:pStyle w:val="berschrift2"/>
       </w:pPr>
-      <w:bookmarkStart w:id="29" w:name="_Toc72093765"/>
+      <w:bookmarkStart w:id="29" w:name="_Toc232344680"/>
       <w:r>
         <w:t>Allgemein</w:t>
       </w:r>
@@ -10588,7 +10989,7 @@
       <w:pPr>
         <w:pStyle w:val="berschrift2"/>
       </w:pPr>
-      <w:bookmarkStart w:id="30" w:name="_Toc72093766"/>
+      <w:bookmarkStart w:id="30" w:name="_Toc232344681"/>
       <w:r>
         <w:t xml:space="preserve">Arbeitsräume für den </w:t>
       </w:r>
@@ -10636,7 +11037,7 @@
       <w:pPr>
         <w:pStyle w:val="berschrift2"/>
       </w:pPr>
-      <w:bookmarkStart w:id="31" w:name="_Toc72093767"/>
+      <w:bookmarkStart w:id="31" w:name="_Toc232344682"/>
       <w:r>
         <w:t>Arbeitsmodi des Notfall-Stabs</w:t>
       </w:r>
@@ -10704,7 +11105,7 @@
       <w:pPr>
         <w:pStyle w:val="berschrift2"/>
       </w:pPr>
-      <w:bookmarkStart w:id="32" w:name="_Toc72093768"/>
+      <w:bookmarkStart w:id="32" w:name="_Toc232344683"/>
       <w:r>
         <w:t xml:space="preserve">Management </w:t>
       </w:r>
@@ -10770,7 +11171,7 @@
       <w:pPr>
         <w:pStyle w:val="berschrift2"/>
       </w:pPr>
-      <w:bookmarkStart w:id="33" w:name="_Toc72093769"/>
+      <w:bookmarkStart w:id="33" w:name="_Toc232344684"/>
       <w:r>
         <w:t>Meldepflichten</w:t>
       </w:r>
@@ -10899,7 +11300,7 @@
       <w:pPr>
         <w:pStyle w:val="berschrift2"/>
       </w:pPr>
-      <w:bookmarkStart w:id="34" w:name="_Toc72093770"/>
+      <w:bookmarkStart w:id="34" w:name="_Toc232344685"/>
       <w:r>
         <w:t>Dokumentation und Beweissicherung</w:t>
       </w:r>
@@ -10909,7 +11310,7 @@
       <w:pPr>
         <w:pStyle w:val="berschrift3"/>
       </w:pPr>
-      <w:bookmarkStart w:id="35" w:name="_Toc72093771"/>
+      <w:bookmarkStart w:id="35" w:name="_Toc232344686"/>
       <w:r>
         <w:t>Protokollierung der Ereignisse</w:t>
       </w:r>
@@ -10928,7 +11329,7 @@
       <w:pPr>
         <w:pStyle w:val="berschrift3"/>
       </w:pPr>
-      <w:bookmarkStart w:id="36" w:name="_Toc72093772"/>
+      <w:bookmarkStart w:id="36" w:name="_Toc232344687"/>
       <w:r>
         <w:lastRenderedPageBreak/>
         <w:t>Forensische Sicherung auf IT-Systemen</w:t>
@@ -10945,7 +11346,7 @@
       <w:pPr>
         <w:pStyle w:val="berschrift2"/>
       </w:pPr>
-      <w:bookmarkStart w:id="37" w:name="_Toc72093773"/>
+      <w:bookmarkStart w:id="37" w:name="_Toc232344688"/>
       <w:r>
         <w:t>Kommunikation</w:t>
       </w:r>
@@ -10955,7 +11356,7 @@
       <w:pPr>
         <w:pStyle w:val="berschrift3"/>
       </w:pPr>
-      <w:bookmarkStart w:id="38" w:name="_Toc72093774"/>
+      <w:bookmarkStart w:id="38" w:name="_Toc232344689"/>
       <w:r>
         <w:t>Interne Kommunikation</w:t>
       </w:r>
@@ -11206,7 +11607,7 @@
       <w:pPr>
         <w:pStyle w:val="berschrift3"/>
       </w:pPr>
-      <w:bookmarkStart w:id="39" w:name="_Toc72093775"/>
+      <w:bookmarkStart w:id="39" w:name="_Toc232344690"/>
       <w:r>
         <w:t>Kommunikation mit Kunden</w:t>
       </w:r>
@@ -11259,7 +11660,7 @@
       <w:pPr>
         <w:pStyle w:val="berschrift3"/>
       </w:pPr>
-      <w:bookmarkStart w:id="40" w:name="_Toc72093776"/>
+      <w:bookmarkStart w:id="40" w:name="_Toc232344691"/>
       <w:r>
         <w:t>Kommunikation mit Behörden und Ämtern</w:t>
       </w:r>
@@ -11321,7 +11722,7 @@
       <w:pPr>
         <w:pStyle w:val="berschrift2"/>
       </w:pPr>
-      <w:bookmarkStart w:id="41" w:name="_Toc72093777"/>
+      <w:bookmarkStart w:id="41" w:name="_Toc232344692"/>
       <w:r>
         <w:t>Ö</w:t>
       </w:r>
@@ -11534,7 +11935,7 @@
       <w:pPr>
         <w:pStyle w:val="berschrift2"/>
       </w:pPr>
-      <w:bookmarkStart w:id="42" w:name="_Toc72093778"/>
+      <w:bookmarkStart w:id="42" w:name="_Toc232344693"/>
       <w:r>
         <w:t xml:space="preserve">Alternative </w:t>
       </w:r>
@@ -11642,7 +12043,7 @@
       <w:pPr>
         <w:pStyle w:val="berschrift1"/>
       </w:pPr>
-      <w:bookmarkStart w:id="43" w:name="_Toc72093779"/>
+      <w:bookmarkStart w:id="43" w:name="_Toc232344694"/>
       <w:r>
         <w:t>Wiederanlauf und Wiederherstellung k</w:t>
       </w:r>
@@ -11666,7 +12067,7 @@
       <w:pPr>
         <w:pStyle w:val="berschrift2"/>
       </w:pPr>
-      <w:bookmarkStart w:id="44" w:name="_Toc72093780"/>
+      <w:bookmarkStart w:id="44" w:name="_Toc232344695"/>
       <w:r>
         <w:t>Liste der k</w:t>
       </w:r>
@@ -12683,7 +13084,7 @@
       <w:pPr>
         <w:pStyle w:val="berschrift2"/>
       </w:pPr>
-      <w:bookmarkStart w:id="45" w:name="_Toc72093781"/>
+      <w:bookmarkStart w:id="45" w:name="_Toc232344696"/>
       <w:r>
         <w:t>Geschäftsprozess: Vertrieb</w:t>
       </w:r>
@@ -13342,7 +13743,7 @@
       <w:pPr>
         <w:pStyle w:val="berschrift2"/>
       </w:pPr>
-      <w:bookmarkStart w:id="46" w:name="_Toc72093782"/>
+      <w:bookmarkStart w:id="46" w:name="_Toc232344697"/>
       <w:r>
         <w:t>Geschäftsprozess: Produktionsplanung</w:t>
       </w:r>
@@ -13697,7 +14098,7 @@
       <w:pPr>
         <w:pStyle w:val="berschrift2"/>
       </w:pPr>
-      <w:bookmarkStart w:id="47" w:name="_Toc72093783"/>
+      <w:bookmarkStart w:id="47" w:name="_Toc232344698"/>
       <w:r>
         <w:t>Geschäftsprozess: Auftragsabwicklung</w:t>
       </w:r>
@@ -13721,7 +14122,7 @@
       <w:pPr>
         <w:pStyle w:val="berschrift1"/>
       </w:pPr>
-      <w:bookmarkStart w:id="48" w:name="_Toc72093784"/>
+      <w:bookmarkStart w:id="48" w:name="_Toc232344699"/>
       <w:r>
         <w:t>Wiederanlauf und Wiederherstellung der k</w:t>
       </w:r>
@@ -13776,7 +14177,7 @@
       <w:pPr>
         <w:pStyle w:val="berschrift2"/>
       </w:pPr>
-      <w:bookmarkStart w:id="49" w:name="_Toc72093785"/>
+      <w:bookmarkStart w:id="49" w:name="_Toc232344700"/>
       <w:r>
         <w:t>Übergreifend</w:t>
       </w:r>
@@ -13786,7 +14187,7 @@
       <w:pPr>
         <w:pStyle w:val="berschrift3"/>
       </w:pPr>
-      <w:bookmarkStart w:id="50" w:name="_Toc72093786"/>
+      <w:bookmarkStart w:id="50" w:name="_Toc232344701"/>
       <w:r>
         <w:t>Mögliche Ersatz</w:t>
       </w:r>
@@ -13880,7 +14281,7 @@
       <w:pPr>
         <w:pStyle w:val="berschrift3"/>
       </w:pPr>
-      <w:bookmarkStart w:id="51" w:name="_Toc72093787"/>
+      <w:bookmarkStart w:id="51" w:name="_Toc232344702"/>
       <w:r>
         <w:t xml:space="preserve">Bedarf </w:t>
       </w:r>
@@ -14385,7 +14786,7 @@
       <w:pPr>
         <w:pStyle w:val="berschrift3"/>
       </w:pPr>
-      <w:bookmarkStart w:id="52" w:name="_Toc72093788"/>
+      <w:bookmarkStart w:id="52" w:name="_Toc232344703"/>
       <w:r>
         <w:t>Dienstleister</w:t>
       </w:r>
@@ -14463,7 +14864,7 @@
       <w:pPr>
         <w:pStyle w:val="berschrift3"/>
       </w:pPr>
-      <w:bookmarkStart w:id="53" w:name="_Toc72093789"/>
+      <w:bookmarkStart w:id="53" w:name="_Toc232344704"/>
       <w:r>
         <w:t>IT-Infrastruktur</w:t>
       </w:r>
@@ -15047,7 +15448,7 @@
       <w:pPr>
         <w:pStyle w:val="berschrift3"/>
       </w:pPr>
-      <w:bookmarkStart w:id="54" w:name="_Toc72093790"/>
+      <w:bookmarkStart w:id="54" w:name="_Toc232344705"/>
       <w:r>
         <w:t>Produktion</w:t>
       </w:r>
@@ -15077,7 +15478,7 @@
       <w:pPr>
         <w:pStyle w:val="berschrift2"/>
       </w:pPr>
-      <w:bookmarkStart w:id="55" w:name="_Toc72093791"/>
+      <w:bookmarkStart w:id="55" w:name="_Toc232344706"/>
       <w:r>
         <w:t xml:space="preserve">Wiederanlauf / Wiederherstellung </w:t>
       </w:r>
@@ -15108,7 +15509,7 @@
       <w:pPr>
         <w:pStyle w:val="berschrift2"/>
       </w:pPr>
-      <w:bookmarkStart w:id="56" w:name="_Toc72093792"/>
+      <w:bookmarkStart w:id="56" w:name="_Toc232344707"/>
       <w:r>
         <w:t xml:space="preserve">Wiederanlauf / Wiederherstellung </w:t>
       </w:r>
@@ -15730,7 +16131,7 @@
       <w:pPr>
         <w:pStyle w:val="berschrift1"/>
       </w:pPr>
-      <w:bookmarkStart w:id="57" w:name="_Toc72093793"/>
+      <w:bookmarkStart w:id="57" w:name="_Toc232344708"/>
       <w:r>
         <w:t>Verzeichnisse</w:t>
       </w:r>
@@ -15740,7 +16141,7 @@
       <w:pPr>
         <w:pStyle w:val="berschrift2"/>
       </w:pPr>
-      <w:bookmarkStart w:id="58" w:name="_Toc72093794"/>
+      <w:bookmarkStart w:id="58" w:name="_Toc232344709"/>
       <w:r>
         <w:t>Kontaktdaten</w:t>
       </w:r>
@@ -15765,7 +16166,7 @@
       <w:pPr>
         <w:pStyle w:val="berschrift3"/>
       </w:pPr>
-      <w:bookmarkStart w:id="59" w:name="_Toc72093795"/>
+      <w:bookmarkStart w:id="59" w:name="_Toc232344710"/>
       <w:r>
         <w:t>Intern</w:t>
       </w:r>
@@ -16035,7 +16436,7 @@
       <w:pPr>
         <w:pStyle w:val="berschrift3"/>
       </w:pPr>
-      <w:bookmarkStart w:id="60" w:name="_Toc72093796"/>
+      <w:bookmarkStart w:id="60" w:name="_Toc232344711"/>
       <w:r>
         <w:t>Dienstleister</w:t>
       </w:r>
@@ -16727,7 +17128,7 @@
       <w:pPr>
         <w:pStyle w:val="berschrift3"/>
       </w:pPr>
-      <w:bookmarkStart w:id="61" w:name="_Toc72093797"/>
+      <w:bookmarkStart w:id="61" w:name="_Toc232344712"/>
       <w:r>
         <w:t>Behörden</w:t>
       </w:r>
@@ -16777,7 +17178,7 @@
       <w:r>
         <w:t xml:space="preserve">siehe </w:t>
       </w:r>
-      <w:hyperlink r:id="rId10" w:history="1">
+      <w:hyperlink r:id="rId9" w:history="1">
         <w:r>
           <w:rPr>
             <w:rStyle w:val="Hyperlink"/>
@@ -16921,7 +17322,7 @@
       <w:pPr>
         <w:pStyle w:val="berschrift3"/>
       </w:pPr>
-      <w:bookmarkStart w:id="62" w:name="_Toc72093798"/>
+      <w:bookmarkStart w:id="62" w:name="_Toc232344713"/>
       <w:r>
         <w:t>Medien</w:t>
       </w:r>
@@ -16986,7 +17387,7 @@
       <w:pPr>
         <w:pStyle w:val="berschrift2"/>
       </w:pPr>
-      <w:bookmarkStart w:id="63" w:name="_Toc72093799"/>
+      <w:bookmarkStart w:id="63" w:name="_Toc232344714"/>
       <w:r>
         <w:t>IT-Umgebung</w:t>
       </w:r>
@@ -17011,7 +17412,7 @@
       <w:pPr>
         <w:pStyle w:val="berschrift3"/>
       </w:pPr>
-      <w:bookmarkStart w:id="64" w:name="_Toc72093800"/>
+      <w:bookmarkStart w:id="64" w:name="_Toc232344715"/>
       <w:r>
         <w:t>Standorte / Niederlassungen</w:t>
       </w:r>
@@ -17133,7 +17534,7 @@
       <w:pPr>
         <w:pStyle w:val="berschrift3"/>
       </w:pPr>
-      <w:bookmarkStart w:id="65" w:name="_Toc72093801"/>
+      <w:bookmarkStart w:id="65" w:name="_Toc232344716"/>
       <w:r>
         <w:t>IT-Infrastruktur</w:t>
       </w:r>
@@ -17219,7 +17620,7 @@
       <w:pPr>
         <w:pStyle w:val="berschrift3"/>
       </w:pPr>
-      <w:bookmarkStart w:id="66" w:name="_Toc72093802"/>
+      <w:bookmarkStart w:id="66" w:name="_Toc232344717"/>
       <w:r>
         <w:t>Anwendungen und Services</w:t>
       </w:r>
@@ -17249,7 +17650,7 @@
       <w:pPr>
         <w:pStyle w:val="berschrift2"/>
       </w:pPr>
-      <w:bookmarkStart w:id="67" w:name="_Toc72093803"/>
+      <w:bookmarkStart w:id="67" w:name="_Toc232344718"/>
       <w:r>
         <w:t>Weitere Verzeichnisse</w:t>
       </w:r>
@@ -17303,12 +17704,12 @@
       </w:r>
     </w:p>
     <w:sectPr>
-      <w:headerReference w:type="even" r:id="rId11"/>
-      <w:headerReference w:type="default" r:id="rId12"/>
-      <w:footerReference w:type="even" r:id="rId13"/>
-      <w:footerReference w:type="default" r:id="rId14"/>
-      <w:headerReference w:type="first" r:id="rId15"/>
-      <w:footerReference w:type="first" r:id="rId16"/>
+      <w:headerReference w:type="even" r:id="rId10"/>
+      <w:headerReference w:type="default" r:id="rId11"/>
+      <w:footerReference w:type="even" r:id="rId12"/>
+      <w:footerReference w:type="default" r:id="rId13"/>
+      <w:headerReference w:type="first" r:id="rId14"/>
+      <w:footerReference w:type="first" r:id="rId15"/>
       <w:pgSz w:w="11906" w:h="16838"/>
       <w:pgMar w:top="1134" w:right="851" w:bottom="1134" w:left="1134" w:header="680" w:footer="680" w:gutter="0"/>
       <w:cols w:space="708"/>

</xml_diff>